<commit_message>
Doc Info Ditte: correzioni (refuso Ferrati, stile heading), abbreviazioni e uniformazione corpo testo, riga fattore 23
Co-authored-by: banditprodo-hue <286061892+banditprodo-hue@users.noreply.github.com>
</commit_message>
<xml_diff>
--- a/Doc_Info ditte (TiTOLO IV) demolizioni GP 65-59.docx
+++ b/Doc_Info ditte (TiTOLO IV) demolizioni GP 65-59.docx
@@ -3316,7 +3316,6 @@
     <w:p/>
     <w:p>
       <w:pPr>
-        <w:pStyle w:val="Titolo1"/>
         <w:jc w:val="both"/>
         <w:rPr>
           <w:rFonts w:ascii="Calibri" w:hAnsi="Calibri" w:cs="Times New Roman"/>
@@ -3339,7 +3338,6 @@
     </w:p>
     <w:p>
       <w:pPr>
-        <w:pStyle w:val="Titolo1"/>
         <w:jc w:val="both"/>
         <w:rPr>
           <w:rFonts w:ascii="Calibri" w:hAnsi="Calibri" w:cs="Times New Roman"/>
@@ -5155,6 +5153,48 @@
           </w:p>
         </w:tc>
       </w:tr>
+      <w:tr>
+        <w:tc>
+          <w:tcPr>
+            <w:tcW w:w="4178" w:type="dxa"/>
+          </w:tcPr>
+          <w:p>
+            <w:pPr>
+              <w:widowControl w:val="0"/>
+              <w:rPr>
+                <w:rFonts w:ascii="Calibri" w:hAnsi="Calibri" w:cs="Calibri"/>
+                <w:szCs w:val="24"/>
+              </w:rPr>
+            </w:pPr>
+            <w:r>
+              <w:rPr>
+                <w:rFonts w:ascii="Calibri" w:hAnsi="Calibri" w:cs="Calibri"/>
+              </w:rPr>
+              <w:t>23 - Organizzazione del Lavoro</w:t>
+            </w:r>
+          </w:p>
+        </w:tc>
+        <w:tc>
+          <w:tcPr>
+            <w:tcW w:w="6312" w:type="dxa"/>
+          </w:tcPr>
+          <w:p>
+            <w:pPr>
+              <w:widowControl w:val="0"/>
+              <w:rPr>
+                <w:rFonts w:ascii="Calibri" w:hAnsi="Calibri" w:cs="Calibri"/>
+                <w:szCs w:val="24"/>
+              </w:rPr>
+            </w:pPr>
+            <w:r>
+              <w:rPr>
+                <w:rFonts w:ascii="Calibri" w:hAnsi="Calibri" w:cs="Calibri"/>
+              </w:rPr>
+              <w:t>Interferenze tra imprese, coordinamento, gestione rifiuti, formazione del personale.</w:t>
+            </w:r>
+          </w:p>
+        </w:tc>
+      </w:tr>
     </w:tbl>
     <w:p>
       <w:pPr>
@@ -5218,7 +5258,7 @@
           <w:rFonts w:ascii="Calibri" w:hAnsi="Calibri" w:cs="Calibri"/>
           <w:b/>
           <w:i/>
-          <w:sz w:val="26"/>
+          <w:sz w:val="24"/>
           <w:szCs w:val="26"/>
           <w:u w:val="single"/>
         </w:rPr>
@@ -5319,7 +5359,7 @@
           <w:rFonts w:ascii="Calibri" w:hAnsi="Calibri" w:cs="Calibri"/>
           <w:b/>
           <w:i/>
-          <w:sz w:val="26"/>
+          <w:sz w:val="24"/>
           <w:szCs w:val="26"/>
           <w:u w:val="single"/>
         </w:rPr>
@@ -5419,7 +5459,7 @@
           <w:rFonts w:ascii="Calibri" w:hAnsi="Calibri" w:cs="Calibri"/>
           <w:b/>
           <w:i/>
-          <w:sz w:val="26"/>
+          <w:sz w:val="24"/>
           <w:szCs w:val="26"/>
           <w:u w:val="single"/>
         </w:rPr>
@@ -5427,6 +5467,20 @@
         <w:t>3/18 – Caduta dall’alto e lavori in quota</w:t>
       </w:r>
       <w:r>
+        <w:rPr>
+          <w:rFonts w:ascii="Calibri" w:hAnsi="Calibri" w:cs="Calibri"/>
+          <w:b/>
+          <w:i/>
+          <w:sz w:val="24"/>
+          <w:szCs w:val="26"/>
+          <w:u w:val="single"/>
+        </w:rPr>
+        <w:t xml:space="preserve"> </w:t>
+      </w:r>
+    </w:p>
+    <w:p>
+      <w:pPr>
+        <w:jc w:val="both"/>
         <w:rPr>
           <w:rFonts w:ascii="Calibri" w:hAnsi="Calibri" w:cs="Calibri"/>
           <w:b/>
@@ -5435,8 +5489,57 @@
           <w:szCs w:val="26"/>
           <w:u w:val="single"/>
         </w:rPr>
-        <w:t xml:space="preserve"> </w:t>
-      </w:r>
+      </w:pPr>
+    </w:p>
+    <w:p>
+      <w:pPr>
+        <w:jc w:val="both"/>
+        <w:rPr>
+          <w:rFonts w:ascii="Calibri" w:hAnsi="Calibri"/>
+        </w:rPr>
+      </w:pPr>
+      <w:r>
+        <w:rPr>
+          <w:rFonts w:ascii="Calibri" w:hAnsi="Calibri"/>
+        </w:rPr>
+        <w:t>Per i tagli in quota gli operatori operano esclusivamente da n. 2 PLE marcate CE, condotte da personale abilitato e con idoneit</w:t>
+      </w:r>
+      <w:r>
+        <w:rPr>
+          <w:rFonts w:ascii="Calibri" w:hAnsi="Calibri"/>
+        </w:rPr>
+        <w:t>à</w:t>
+      </w:r>
+      <w:r>
+        <w:rPr>
+          <w:rFonts w:ascii="Calibri" w:hAnsi="Calibri"/>
+        </w:rPr>
+        <w:t xml:space="preserve"> sanitaria. Sulla PLE salgono solo il manovratore abilitato e gli operatori incaricati, dotati di DPI anticaduta (casco, imbracatura EN 361 con dispositivo anticaduta). Per lavori in quota superiori a 2 m si applicano integralmente le prescrizioni del Titolo IV, Capo II del </w:t>
+      </w:r>
+      <w:proofErr w:type="spellStart"/>
+      <w:r>
+        <w:rPr>
+          <w:rFonts w:ascii="Calibri" w:hAnsi="Calibri"/>
+        </w:rPr>
+        <w:t>D.Lgs.</w:t>
+      </w:r>
+      <w:proofErr w:type="spellEnd"/>
+      <w:r>
+        <w:rPr>
+          <w:rFonts w:ascii="Calibri" w:hAnsi="Calibri"/>
+        </w:rPr>
+        <w:t xml:space="preserve"> 81/2008. Vietato l'uso di trabattelli per quote superiori a 8 m nei luoghi esterni.</w:t>
+      </w:r>
+    </w:p>
+    <w:p>
+      <w:pPr>
+        <w:pStyle w:val="Corpotesto"/>
+        <w:ind w:left="720"/>
+        <w:rPr>
+          <w:rFonts w:ascii="Calibri" w:hAnsi="Calibri"/>
+          <w:lang w:val="it-IT"/>
+        </w:rPr>
+      </w:pPr>
     </w:p>
     <w:p>
       <w:pPr>
@@ -5450,45 +5553,424 @@
           <w:u w:val="single"/>
         </w:rPr>
       </w:pPr>
-    </w:p>
-    <w:p>
-      <w:pPr>
-        <w:jc w:val="both"/>
+      <w:r>
+        <w:rPr>
+          <w:rFonts w:ascii="Calibri" w:hAnsi="Calibri" w:cs="Calibri"/>
+          <w:b/>
+          <w:i/>
+          <w:sz w:val="24"/>
+          <w:szCs w:val="26"/>
+          <w:u w:val="single"/>
+        </w:rPr>
+        <w:t xml:space="preserve">10 – Apparecchi di sollevamento – movimentazione carichi </w:t>
+      </w:r>
+    </w:p>
+    <w:p>
+      <w:pPr>
+        <w:suppressAutoHyphens w:val="0"/>
+        <w:autoSpaceDE w:val="0"/>
+        <w:autoSpaceDN w:val="0"/>
+        <w:adjustRightInd w:val="0"/>
+        <w:rPr>
+          <w:i/>
+          <w:sz w:val="16"/>
+          <w:szCs w:val="16"/>
+          <w:u w:val="single"/>
+        </w:rPr>
+      </w:pPr>
+    </w:p>
+    <w:p>
+      <w:pPr>
+        <w:pStyle w:val="Corpotesto"/>
+        <w:numPr>
+          <w:ilvl w:val="0"/>
+          <w:numId w:val="24"/>
+        </w:numPr>
         <w:rPr>
           <w:rFonts w:ascii="Calibri" w:hAnsi="Calibri"/>
+          <w:lang w:val="it-IT"/>
         </w:rPr>
       </w:pPr>
       <w:r>
         <w:rPr>
           <w:rFonts w:ascii="Calibri" w:hAnsi="Calibri"/>
-        </w:rPr>
-        <w:t>Per i tagli in quota gli operatori operano esclusivamente da n. 2 PLE marcate CE, condotte da personale abilitato e con idoneit</w:t>
+          <w:lang w:val="it-IT"/>
+        </w:rPr>
+        <w:t xml:space="preserve">Non sono presenti linee elettriche aeree che possano interferire con la movimentazione dei carichi presso il Bacino </w:t>
       </w:r>
       <w:r>
         <w:rPr>
           <w:rFonts w:ascii="Calibri" w:hAnsi="Calibri"/>
-        </w:rPr>
-        <w:t>à</w:t>
+          <w:lang w:val="it-IT"/>
+        </w:rPr>
+        <w:t>Ferrati</w:t>
       </w:r>
       <w:r>
         <w:rPr>
           <w:rFonts w:ascii="Calibri" w:hAnsi="Calibri"/>
-        </w:rPr>
-        <w:t xml:space="preserve"> sanitaria. Sulla PLE salgono solo il manovratore abilitato e gli operatori incaricati, dotati di DPI anticaduta (casco, imbracatura EN 361 con dispositivo anticaduta). Per lavori in quota superiori a 2 m si applicano integralmente le prescrizioni del Titolo IV, Capo II del </w:t>
+          <w:lang w:val="it-IT"/>
+        </w:rPr>
+        <w:t xml:space="preserve">. </w:t>
+      </w:r>
+    </w:p>
+    <w:p>
+      <w:pPr>
+        <w:pStyle w:val="Corpotesto"/>
+        <w:numPr>
+          <w:ilvl w:val="0"/>
+          <w:numId w:val="24"/>
+        </w:numPr>
+        <w:rPr>
+          <w:rFonts w:ascii="Calibri" w:hAnsi="Calibri"/>
+          <w:lang w:val="it-IT"/>
+        </w:rPr>
+      </w:pPr>
+      <w:r>
+        <w:rPr>
+          <w:rFonts w:ascii="Calibri" w:hAnsi="Calibri"/>
+          <w:lang w:val="it-IT"/>
+        </w:rPr>
+        <w:t>È vietato effettuare attività di movimentazione nelle immediate vicinanze del corrimano: mantenere distanze di sicurezza.</w:t>
+      </w:r>
+      <w:r>
+        <w:rPr>
+          <w:lang w:val="it-IT"/>
+        </w:rPr>
+        <w:t xml:space="preserve"> </w:t>
+      </w:r>
+    </w:p>
+    <w:p>
+      <w:pPr>
+        <w:pStyle w:val="Corpotesto"/>
+        <w:numPr>
+          <w:ilvl w:val="0"/>
+          <w:numId w:val="24"/>
+        </w:numPr>
+        <w:rPr>
+          <w:rFonts w:ascii="Calibri" w:hAnsi="Calibri"/>
+          <w:lang w:val="it-IT"/>
+        </w:rPr>
+      </w:pPr>
+      <w:r>
+        <w:rPr>
+          <w:rFonts w:ascii="Calibri" w:hAnsi="Calibri"/>
+          <w:lang w:val="it-IT"/>
+        </w:rPr>
+        <w:t>Prima dell'utilizzo l'impresa noleggiatrice (</w:t>
       </w:r>
       <w:proofErr w:type="spellStart"/>
       <w:r>
         <w:rPr>
           <w:rFonts w:ascii="Calibri" w:hAnsi="Calibri"/>
-        </w:rPr>
-        <w:t>D.Lgs.</w:t>
+          <w:lang w:val="it-IT"/>
+        </w:rPr>
+        <w:t>Peyrani</w:t>
       </w:r>
       <w:proofErr w:type="spellEnd"/>
       <w:r>
         <w:rPr>
           <w:rFonts w:ascii="Calibri" w:hAnsi="Calibri"/>
-        </w:rPr>
-        <w:t xml:space="preserve"> 81/2008. Vietato l'uso di trabattelli per quote superiori a 8 m nei luoghi esterni.</w:t>
+          <w:lang w:val="it-IT"/>
+        </w:rPr>
+        <w:t xml:space="preserve">) deve consegnare: </w:t>
+      </w:r>
+    </w:p>
+    <w:p>
+      <w:pPr>
+        <w:pStyle w:val="Corpotesto"/>
+        <w:numPr>
+          <w:ilvl w:val="0"/>
+          <w:numId w:val="29"/>
+        </w:numPr>
+        <w:rPr>
+          <w:rFonts w:ascii="Calibri" w:hAnsi="Calibri"/>
+          <w:lang w:val="it-IT"/>
+        </w:rPr>
+      </w:pPr>
+      <w:r>
+        <w:rPr>
+          <w:rFonts w:ascii="Calibri" w:hAnsi="Calibri"/>
+          <w:lang w:val="it-IT"/>
+        </w:rPr>
+        <w:t xml:space="preserve">dichiarazione di conformità CE, </w:t>
+      </w:r>
+    </w:p>
+    <w:p>
+      <w:pPr>
+        <w:pStyle w:val="Corpotesto"/>
+        <w:numPr>
+          <w:ilvl w:val="0"/>
+          <w:numId w:val="29"/>
+        </w:numPr>
+        <w:rPr>
+          <w:rFonts w:ascii="Calibri" w:hAnsi="Calibri"/>
+          <w:lang w:val="it-IT"/>
+        </w:rPr>
+      </w:pPr>
+      <w:r>
+        <w:rPr>
+          <w:rFonts w:ascii="Calibri" w:hAnsi="Calibri"/>
+          <w:lang w:val="it-IT"/>
+        </w:rPr>
+        <w:t xml:space="preserve">registro di uso/manutenzione, </w:t>
+      </w:r>
+    </w:p>
+    <w:p>
+      <w:pPr>
+        <w:pStyle w:val="Corpotesto"/>
+        <w:numPr>
+          <w:ilvl w:val="0"/>
+          <w:numId w:val="29"/>
+        </w:numPr>
+        <w:rPr>
+          <w:rFonts w:ascii="Calibri" w:hAnsi="Calibri"/>
+          <w:lang w:val="it-IT"/>
+        </w:rPr>
+      </w:pPr>
+      <w:r>
+        <w:rPr>
+          <w:rFonts w:ascii="Calibri" w:hAnsi="Calibri"/>
+          <w:lang w:val="it-IT"/>
+        </w:rPr>
+        <w:t xml:space="preserve">verbale dell'ultima verifica periodica, </w:t>
+      </w:r>
+    </w:p>
+    <w:p>
+      <w:pPr>
+        <w:pStyle w:val="Corpotesto"/>
+        <w:numPr>
+          <w:ilvl w:val="0"/>
+          <w:numId w:val="29"/>
+        </w:numPr>
+        <w:rPr>
+          <w:rFonts w:ascii="Calibri" w:hAnsi="Calibri"/>
+          <w:lang w:val="it-IT"/>
+        </w:rPr>
+      </w:pPr>
+      <w:r>
+        <w:rPr>
+          <w:rFonts w:ascii="Calibri" w:hAnsi="Calibri"/>
+          <w:lang w:val="it-IT"/>
+        </w:rPr>
+        <w:t xml:space="preserve">dichiarazione di regolare manutenzione, </w:t>
+      </w:r>
+    </w:p>
+    <w:p>
+      <w:pPr>
+        <w:pStyle w:val="Corpotesto"/>
+        <w:numPr>
+          <w:ilvl w:val="0"/>
+          <w:numId w:val="29"/>
+        </w:numPr>
+        <w:rPr>
+          <w:rFonts w:ascii="Calibri" w:hAnsi="Calibri"/>
+          <w:lang w:val="it-IT"/>
+        </w:rPr>
+      </w:pPr>
+      <w:r>
+        <w:rPr>
+          <w:rFonts w:ascii="Calibri" w:hAnsi="Calibri"/>
+          <w:lang w:val="it-IT"/>
+        </w:rPr>
+        <w:t>certificazione CE degli accessori di sollevamento e attestato di abilitazione del conduttore.</w:t>
+      </w:r>
+    </w:p>
+    <w:p>
+      <w:pPr>
+        <w:pStyle w:val="Corpotesto"/>
+        <w:rPr>
+          <w:rFonts w:ascii="Calibri" w:hAnsi="Calibri" w:cs="Times New Roman"/>
+          <w:b/>
+          <w:lang w:val="it-IT"/>
+        </w:rPr>
+      </w:pPr>
+      <w:r>
+        <w:rPr>
+          <w:rFonts w:ascii="Calibri" w:hAnsi="Calibri" w:cs="Times New Roman"/>
+          <w:b/>
+          <w:lang w:val="it-IT"/>
+        </w:rPr>
+        <w:t>Misure:</w:t>
+      </w:r>
+    </w:p>
+    <w:p>
+      <w:pPr>
+        <w:pStyle w:val="Corpotesto"/>
+        <w:numPr>
+          <w:ilvl w:val="0"/>
+          <w:numId w:val="32"/>
+        </w:numPr>
+        <w:rPr>
+          <w:rFonts w:ascii="Calibri" w:hAnsi="Calibri" w:cs="Times New Roman"/>
+          <w:lang w:val="it-IT"/>
+        </w:rPr>
+      </w:pPr>
+      <w:r>
+        <w:rPr>
+          <w:rFonts w:ascii="Calibri" w:hAnsi="Calibri" w:cs="Times New Roman"/>
+          <w:lang w:val="it-IT"/>
+        </w:rPr>
+        <w:t>Usare attrezzature a norma di legge, vietando l’uso di attrezzature non rispondenti o danneggiate.</w:t>
+      </w:r>
+    </w:p>
+    <w:p>
+      <w:pPr>
+        <w:pStyle w:val="Corpotesto"/>
+        <w:numPr>
+          <w:ilvl w:val="0"/>
+          <w:numId w:val="32"/>
+        </w:numPr>
+        <w:rPr>
+          <w:rFonts w:ascii="Calibri" w:hAnsi="Calibri" w:cs="Times New Roman"/>
+          <w:lang w:val="it-IT"/>
+        </w:rPr>
+      </w:pPr>
+      <w:r>
+        <w:rPr>
+          <w:rFonts w:ascii="Calibri" w:hAnsi="Calibri" w:cs="Times New Roman"/>
+          <w:lang w:val="it-IT"/>
+        </w:rPr>
+        <w:t>La conduzione e l’utilizzo degli apparecchi di sollevamento può essere effettuato soltanto dal personale dotato della relativa abilitazione.</w:t>
+      </w:r>
+    </w:p>
+    <w:p>
+      <w:pPr>
+        <w:pStyle w:val="Corpotesto"/>
+        <w:numPr>
+          <w:ilvl w:val="0"/>
+          <w:numId w:val="32"/>
+        </w:numPr>
+        <w:rPr>
+          <w:rFonts w:ascii="Calibri" w:hAnsi="Calibri" w:cs="Times New Roman"/>
+          <w:lang w:val="it-IT"/>
+        </w:rPr>
+      </w:pPr>
+      <w:r>
+        <w:rPr>
+          <w:rFonts w:ascii="Calibri" w:hAnsi="Calibri" w:cs="Times New Roman"/>
+          <w:lang w:val="it-IT"/>
+        </w:rPr>
+        <w:t xml:space="preserve">Nel caso di utilizzo di autogru, è vietato posizionare gli stabilizzatori in prossimità del margine della banchina o su piani non resistenti, quali beole, vie di corsa delle gru (binari), coperture dei cunicoli o cavidotti. </w:t>
+      </w:r>
+    </w:p>
+    <w:p>
+      <w:pPr>
+        <w:pStyle w:val="Corpotesto"/>
+        <w:numPr>
+          <w:ilvl w:val="0"/>
+          <w:numId w:val="32"/>
+        </w:numPr>
+        <w:rPr>
+          <w:rFonts w:ascii="Calibri" w:hAnsi="Calibri" w:cs="Times New Roman"/>
+          <w:lang w:val="it-IT"/>
+        </w:rPr>
+      </w:pPr>
+      <w:r>
+        <w:rPr>
+          <w:rFonts w:ascii="Calibri" w:hAnsi="Calibri" w:cs="Times New Roman"/>
+          <w:lang w:val="it-IT"/>
+        </w:rPr>
+        <w:t>Non sono note le portate massime di carico in banchina.</w:t>
+      </w:r>
+    </w:p>
+    <w:p>
+      <w:pPr>
+        <w:pStyle w:val="Corpotesto"/>
+        <w:numPr>
+          <w:ilvl w:val="0"/>
+          <w:numId w:val="32"/>
+        </w:numPr>
+        <w:rPr>
+          <w:rFonts w:ascii="Calibri" w:hAnsi="Calibri" w:cs="Times New Roman"/>
+          <w:lang w:val="it-IT"/>
+        </w:rPr>
+      </w:pPr>
+      <w:r>
+        <w:rPr>
+          <w:rFonts w:ascii="Calibri" w:hAnsi="Calibri" w:cs="Times New Roman"/>
+          <w:lang w:val="it-IT"/>
+        </w:rPr>
+        <w:t>Vietato movimentare i carichi con il personale presente nella sottostante area di intervento.</w:t>
+      </w:r>
+    </w:p>
+    <w:p>
+      <w:pPr>
+        <w:pStyle w:val="Corpotesto"/>
+        <w:numPr>
+          <w:ilvl w:val="0"/>
+          <w:numId w:val="32"/>
+        </w:numPr>
+        <w:rPr>
+          <w:rFonts w:ascii="Calibri" w:hAnsi="Calibri" w:cs="Times New Roman"/>
+          <w:lang w:val="it-IT"/>
+        </w:rPr>
+      </w:pPr>
+      <w:r>
+        <w:rPr>
+          <w:rFonts w:ascii="Calibri" w:hAnsi="Calibri" w:cs="Times New Roman"/>
+          <w:lang w:val="it-IT"/>
+        </w:rPr>
+        <w:t>Non ingombrare con automezzi o materiali le vie di corsa delle gru (binari e cavidotto di alimentazione).</w:t>
+      </w:r>
+    </w:p>
+    <w:p>
+      <w:pPr>
+        <w:pStyle w:val="Corpotesto"/>
+        <w:numPr>
+          <w:ilvl w:val="0"/>
+          <w:numId w:val="32"/>
+        </w:numPr>
+        <w:rPr>
+          <w:rFonts w:ascii="Calibri" w:hAnsi="Calibri" w:cs="Times New Roman"/>
+          <w:lang w:val="it-IT"/>
+        </w:rPr>
+      </w:pPr>
+      <w:r>
+        <w:rPr>
+          <w:rFonts w:ascii="Calibri" w:hAnsi="Calibri" w:cs="Times New Roman"/>
+          <w:lang w:val="it-IT"/>
+        </w:rPr>
+        <w:t>Utilizzare accessori di sollevamento marcati CE.</w:t>
+      </w:r>
+    </w:p>
+    <w:p>
+      <w:pPr>
+        <w:pStyle w:val="Corpotesto"/>
+        <w:numPr>
+          <w:ilvl w:val="0"/>
+          <w:numId w:val="32"/>
+        </w:numPr>
+        <w:rPr>
+          <w:rFonts w:ascii="Calibri" w:hAnsi="Calibri" w:cs="Times New Roman"/>
+          <w:lang w:val="it-IT"/>
+        </w:rPr>
+      </w:pPr>
+      <w:r>
+        <w:rPr>
+          <w:rFonts w:ascii="Calibri" w:hAnsi="Calibri" w:cs="Times New Roman"/>
+          <w:lang w:val="it-IT"/>
+        </w:rPr>
+        <w:t xml:space="preserve">Si raccomanda di rispettare i divieti e le prescrizioni se l’attività da svolgere prevede lo stazionamento nei pressi d’apparecchiature od attrezzature in genere. </w:t>
+      </w:r>
+    </w:p>
+    <w:p>
+      <w:pPr>
+        <w:pStyle w:val="Corpotesto"/>
+        <w:numPr>
+          <w:ilvl w:val="0"/>
+          <w:numId w:val="32"/>
+        </w:numPr>
+        <w:rPr>
+          <w:rFonts w:ascii="Calibri" w:hAnsi="Calibri" w:cs="Times New Roman"/>
+          <w:lang w:val="it-IT"/>
+        </w:rPr>
+      </w:pPr>
+      <w:r>
+        <w:rPr>
+          <w:rFonts w:ascii="Calibri" w:hAnsi="Calibri" w:cs="Times New Roman"/>
+          <w:lang w:val="it-IT"/>
+        </w:rPr>
+        <w:t>Non stazionare od operare nel raggio d’azione dei mezzi di sollevamento ed in particolare nelle aree scoperte destinate alle lavorazioni, banchine lavori, piazzali antistanti alle officine, piazzali nei pressi dei bacini in muratura, ecc. (aree pericolose).</w:t>
       </w:r>
     </w:p>
     <w:p>
@@ -5496,7 +5978,285 @@
         <w:pStyle w:val="Corpotesto"/>
         <w:ind w:left="720"/>
         <w:rPr>
-          <w:rFonts w:ascii="Calibri" w:hAnsi="Calibri"/>
+          <w:rFonts w:ascii="Calibri" w:hAnsi="Calibri" w:cs="Times New Roman"/>
+          <w:lang w:val="it-IT"/>
+        </w:rPr>
+      </w:pPr>
+    </w:p>
+    <w:p>
+      <w:pPr>
+        <w:pStyle w:val="Corpotesto"/>
+        <w:rPr>
+          <w:rFonts w:ascii="Calibri" w:hAnsi="Calibri" w:cs="Times New Roman"/>
+          <w:b/>
+          <w:lang w:val="it-IT"/>
+        </w:rPr>
+      </w:pPr>
+      <w:r>
+        <w:rPr>
+          <w:rFonts w:ascii="Calibri" w:hAnsi="Calibri" w:cs="Times New Roman"/>
+          <w:b/>
+          <w:lang w:val="it-IT"/>
+        </w:rPr>
+        <w:t>Attuare, inoltre, le seguenti misure:</w:t>
+      </w:r>
+    </w:p>
+    <w:p>
+      <w:pPr>
+        <w:pStyle w:val="Corpotesto"/>
+        <w:numPr>
+          <w:ilvl w:val="0"/>
+          <w:numId w:val="33"/>
+        </w:numPr>
+        <w:rPr>
+          <w:rFonts w:ascii="Calibri" w:hAnsi="Calibri" w:cs="Times New Roman"/>
+          <w:lang w:val="it-IT"/>
+        </w:rPr>
+      </w:pPr>
+      <w:r>
+        <w:rPr>
+          <w:rFonts w:ascii="Calibri" w:hAnsi="Calibri" w:cs="Times New Roman"/>
+          <w:lang w:val="it-IT"/>
+        </w:rPr>
+        <w:t>predisposizione di appositi documenti con l'identificazione degli accessori di sollevamento;</w:t>
+      </w:r>
+    </w:p>
+    <w:p>
+      <w:pPr>
+        <w:pStyle w:val="Corpotesto"/>
+        <w:numPr>
+          <w:ilvl w:val="0"/>
+          <w:numId w:val="33"/>
+        </w:numPr>
+        <w:rPr>
+          <w:rFonts w:ascii="Calibri" w:hAnsi="Calibri" w:cs="Times New Roman"/>
+          <w:lang w:val="it-IT"/>
+        </w:rPr>
+      </w:pPr>
+      <w:r>
+        <w:rPr>
+          <w:rFonts w:ascii="Calibri" w:hAnsi="Calibri" w:cs="Times New Roman"/>
+          <w:lang w:val="it-IT"/>
+        </w:rPr>
+        <w:t xml:space="preserve">verifiche periodiche di legge per tutte le attrezzature di sollevamento e verifiche periodiche trimestrale delle funi degli apparecchi di sollevamento; </w:t>
+      </w:r>
+    </w:p>
+    <w:p>
+      <w:pPr>
+        <w:pStyle w:val="Corpotesto"/>
+        <w:numPr>
+          <w:ilvl w:val="0"/>
+          <w:numId w:val="33"/>
+        </w:numPr>
+        <w:rPr>
+          <w:rFonts w:ascii="Calibri" w:hAnsi="Calibri" w:cs="Times New Roman"/>
+          <w:lang w:val="it-IT"/>
+        </w:rPr>
+      </w:pPr>
+      <w:r>
+        <w:rPr>
+          <w:rFonts w:ascii="Calibri" w:hAnsi="Calibri" w:cs="Times New Roman"/>
+          <w:lang w:val="it-IT"/>
+        </w:rPr>
+        <w:t>manutenzione preventiva programmata dei mezzi di sollevamento, secondo le indicazioni del costruttore;</w:t>
+      </w:r>
+    </w:p>
+    <w:p>
+      <w:pPr>
+        <w:pStyle w:val="Corpotesto"/>
+        <w:numPr>
+          <w:ilvl w:val="0"/>
+          <w:numId w:val="33"/>
+        </w:numPr>
+        <w:rPr>
+          <w:rFonts w:ascii="Calibri" w:hAnsi="Calibri" w:cs="Times New Roman"/>
+          <w:lang w:val="it-IT"/>
+        </w:rPr>
+      </w:pPr>
+      <w:r>
+        <w:rPr>
+          <w:rFonts w:ascii="Calibri" w:hAnsi="Calibri" w:cs="Times New Roman"/>
+          <w:lang w:val="it-IT"/>
+        </w:rPr>
+        <w:t>informazione e formazione del personale;</w:t>
+      </w:r>
+    </w:p>
+    <w:p>
+      <w:pPr>
+        <w:pStyle w:val="Corpotesto"/>
+        <w:numPr>
+          <w:ilvl w:val="0"/>
+          <w:numId w:val="33"/>
+        </w:numPr>
+        <w:rPr>
+          <w:rFonts w:ascii="Calibri" w:hAnsi="Calibri" w:cs="Times New Roman"/>
+          <w:lang w:val="it-IT"/>
+        </w:rPr>
+      </w:pPr>
+      <w:r>
+        <w:rPr>
+          <w:rFonts w:ascii="Calibri" w:hAnsi="Calibri" w:cs="Times New Roman"/>
+          <w:lang w:val="it-IT"/>
+        </w:rPr>
+        <w:t>predisposizione di idonei contenitori per le varie tipologie di materiali sciolti;</w:t>
+      </w:r>
+    </w:p>
+    <w:p>
+      <w:pPr>
+        <w:pStyle w:val="Corpotesto"/>
+        <w:numPr>
+          <w:ilvl w:val="0"/>
+          <w:numId w:val="33"/>
+        </w:numPr>
+        <w:rPr>
+          <w:rFonts w:ascii="Calibri" w:hAnsi="Calibri" w:cs="Times New Roman"/>
+          <w:lang w:val="it-IT"/>
+        </w:rPr>
+      </w:pPr>
+      <w:r>
+        <w:rPr>
+          <w:rFonts w:ascii="Calibri" w:hAnsi="Calibri" w:cs="Times New Roman"/>
+          <w:lang w:val="it-IT"/>
+        </w:rPr>
+        <w:lastRenderedPageBreak/>
+        <w:t>g</w:t>
+      </w:r>
+      <w:r>
+        <w:rPr>
+          <w:rFonts w:ascii="Calibri" w:hAnsi="Calibri" w:cs="Times New Roman"/>
+          <w:lang w:val="it-IT"/>
+        </w:rPr>
+        <w:t>li operatori ed il gruista devono comunicare mediante comunicazione gestuale codificata o</w:t>
+      </w:r>
+      <w:r>
+        <w:rPr>
+          <w:rFonts w:ascii="Calibri" w:hAnsi="Calibri" w:cs="Times New Roman"/>
+          <w:lang w:val="it-IT"/>
+        </w:rPr>
+        <w:t xml:space="preserve"> </w:t>
+      </w:r>
+      <w:r>
+        <w:rPr>
+          <w:rFonts w:ascii="Calibri" w:hAnsi="Calibri" w:cs="Times New Roman"/>
+          <w:lang w:val="it-IT"/>
+        </w:rPr>
+        <w:t>ricetrasmittenti radio;</w:t>
+      </w:r>
+    </w:p>
+    <w:p>
+      <w:pPr>
+        <w:pStyle w:val="Corpotesto"/>
+        <w:numPr>
+          <w:ilvl w:val="0"/>
+          <w:numId w:val="33"/>
+        </w:numPr>
+        <w:rPr>
+          <w:rFonts w:ascii="Calibri" w:hAnsi="Calibri" w:cs="Times New Roman"/>
+          <w:lang w:val="it-IT"/>
+        </w:rPr>
+      </w:pPr>
+      <w:r>
+        <w:rPr>
+          <w:rFonts w:ascii="Calibri" w:hAnsi="Calibri" w:cs="Times New Roman"/>
+          <w:lang w:val="it-IT"/>
+        </w:rPr>
+        <w:t>interdizione di aree sottostanti i lavori in altezza.</w:t>
+      </w:r>
+    </w:p>
+    <w:p>
+      <w:pPr>
+        <w:pStyle w:val="Corpotesto"/>
+        <w:ind w:left="720"/>
+        <w:rPr>
+          <w:rFonts w:ascii="Calibri" w:hAnsi="Calibri" w:cs="Times New Roman"/>
+          <w:lang w:val="it-IT"/>
+        </w:rPr>
+      </w:pPr>
+    </w:p>
+    <w:p>
+      <w:pPr>
+        <w:pStyle w:val="Corpotesto"/>
+        <w:rPr>
+          <w:rFonts w:ascii="Calibri" w:hAnsi="Calibri" w:cs="Times New Roman"/>
+          <w:b/>
+          <w:lang w:val="it-IT"/>
+        </w:rPr>
+      </w:pPr>
+      <w:r>
+        <w:rPr>
+          <w:rFonts w:ascii="Calibri" w:hAnsi="Calibri" w:cs="Times New Roman"/>
+          <w:b/>
+          <w:lang w:val="it-IT"/>
+        </w:rPr>
+        <w:t>Obbligatorio l'uso dei seguenti dispositivi di protezione individuale (DPI):</w:t>
+      </w:r>
+    </w:p>
+    <w:p>
+      <w:pPr>
+        <w:pStyle w:val="Corpotesto"/>
+        <w:numPr>
+          <w:ilvl w:val="0"/>
+          <w:numId w:val="34"/>
+        </w:numPr>
+        <w:rPr>
+          <w:rFonts w:ascii="Calibri" w:hAnsi="Calibri" w:cs="Times New Roman"/>
+          <w:lang w:val="it-IT"/>
+        </w:rPr>
+      </w:pPr>
+      <w:r>
+        <w:rPr>
+          <w:rFonts w:ascii="Calibri" w:hAnsi="Calibri" w:cs="Times New Roman"/>
+          <w:lang w:val="it-IT"/>
+        </w:rPr>
+        <w:t>elmetto di protezione;</w:t>
+      </w:r>
+    </w:p>
+    <w:p>
+      <w:pPr>
+        <w:pStyle w:val="Corpotesto"/>
+        <w:numPr>
+          <w:ilvl w:val="0"/>
+          <w:numId w:val="34"/>
+        </w:numPr>
+        <w:rPr>
+          <w:rFonts w:ascii="Calibri" w:hAnsi="Calibri" w:cs="Times New Roman"/>
+          <w:lang w:val="it-IT"/>
+        </w:rPr>
+      </w:pPr>
+      <w:r>
+        <w:rPr>
+          <w:rFonts w:ascii="Calibri" w:hAnsi="Calibri" w:cs="Times New Roman"/>
+          <w:lang w:val="it-IT"/>
+        </w:rPr>
+        <w:t>guanti per il rischio meccanico;</w:t>
+      </w:r>
+    </w:p>
+    <w:p>
+      <w:pPr>
+        <w:pStyle w:val="Corpotesto"/>
+        <w:numPr>
+          <w:ilvl w:val="0"/>
+          <w:numId w:val="34"/>
+        </w:numPr>
+        <w:rPr>
+          <w:rFonts w:ascii="Calibri" w:hAnsi="Calibri" w:cs="Times New Roman"/>
+          <w:lang w:val="it-IT"/>
+        </w:rPr>
+      </w:pPr>
+      <w:r>
+        <w:rPr>
+          <w:rFonts w:ascii="Calibri" w:hAnsi="Calibri" w:cs="Times New Roman"/>
+          <w:lang w:val="it-IT"/>
+        </w:rPr>
+        <w:t>calzature di sicurezza con puntale in acciaio ed a sfilamento rapido.</w:t>
+      </w:r>
+    </w:p>
+    <w:p>
+      <w:pPr>
+        <w:pStyle w:val="Corpotesto"/>
+        <w:ind w:left="720"/>
+        <w:rPr>
+          <w:rFonts w:ascii="Calibri" w:hAnsi="Calibri" w:cs="Times New Roman"/>
           <w:lang w:val="it-IT"/>
         </w:rPr>
       </w:pPr>
@@ -5518,705 +6278,94 @@
           <w:rFonts w:ascii="Calibri" w:hAnsi="Calibri" w:cs="Calibri"/>
           <w:b/>
           <w:i/>
-          <w:sz w:val="26"/>
+          <w:sz w:val="24"/>
           <w:szCs w:val="26"/>
           <w:u w:val="single"/>
         </w:rPr>
-        <w:t xml:space="preserve">10 – Apparecchi di sollevamento – movimentazione carichi </w:t>
-      </w:r>
-    </w:p>
-    <w:p>
-      <w:pPr>
-        <w:suppressAutoHyphens w:val="0"/>
-        <w:autoSpaceDE w:val="0"/>
-        <w:autoSpaceDN w:val="0"/>
-        <w:adjustRightInd w:val="0"/>
-        <w:rPr>
-          <w:i/>
-          <w:sz w:val="16"/>
-          <w:szCs w:val="16"/>
-          <w:u w:val="single"/>
-        </w:rPr>
-      </w:pPr>
+        <w:t xml:space="preserve">13 – Impianti elettrici </w:t>
+      </w:r>
     </w:p>
     <w:p>
       <w:pPr>
         <w:pStyle w:val="Corpotesto"/>
-        <w:numPr>
-          <w:ilvl w:val="0"/>
-          <w:numId w:val="24"/>
-        </w:numPr>
+        <w:ind w:hanging="1"/>
         <w:rPr>
           <w:rFonts w:ascii="Calibri" w:hAnsi="Calibri"/>
-          <w:lang w:val="it-IT"/>
-        </w:rPr>
-      </w:pPr>
-      <w:r>
+          <w:szCs w:val="24"/>
+          <w:lang w:val="it-IT"/>
+        </w:rPr>
+      </w:pPr>
+    </w:p>
+    <w:p>
+      <w:pPr>
+        <w:pStyle w:val="Corpotesto"/>
         <w:rPr>
           <w:rFonts w:ascii="Calibri" w:hAnsi="Calibri"/>
-          <w:lang w:val="it-IT"/>
-        </w:rPr>
-        <w:t xml:space="preserve">Non sono presenti linee elettriche aeree che possano interferire con la movimentazione dei carichi presso il Bacino </w:t>
-      </w:r>
+          <w:szCs w:val="24"/>
+          <w:lang w:val="it-IT"/>
+        </w:rPr>
+      </w:pPr>
       <w:r>
         <w:rPr>
           <w:rFonts w:ascii="Calibri" w:hAnsi="Calibri"/>
-          <w:lang w:val="it-IT"/>
-        </w:rPr>
-        <w:t>Ferrari</w:t>
-      </w:r>
+          <w:szCs w:val="24"/>
+          <w:lang w:val="it-IT"/>
+        </w:rPr>
+        <w:t xml:space="preserve">Il punto di prelievo dell'energia elettrica sarà reso disponibile a cura di </w:t>
+      </w:r>
+      <w:proofErr w:type="spellStart"/>
       <w:r>
         <w:rPr>
           <w:rFonts w:ascii="Calibri" w:hAnsi="Calibri"/>
-          <w:lang w:val="it-IT"/>
-        </w:rPr>
-        <w:t xml:space="preserve">. </w:t>
+          <w:szCs w:val="24"/>
+          <w:lang w:val="it-IT"/>
+        </w:rPr>
+        <w:t>Marinarsen</w:t>
+      </w:r>
+      <w:proofErr w:type="spellEnd"/>
+      <w:r>
+        <w:rPr>
+          <w:rFonts w:ascii="Calibri" w:hAnsi="Calibri"/>
+          <w:szCs w:val="24"/>
+          <w:lang w:val="it-IT"/>
+        </w:rPr>
+        <w:t>; è fatto tassativo divieto di superare l’assorbimento di potenza massima consentita. Il collegamento tra il quadro elettrico di cantiere e il punto di consegna deve essere realizzato a regola d'arte, utilizzando cavi a doppio isolamento con sezione adeguata al carico e guaina idonea per la posa esterna in condizioni ambientali severe. La posa delle condutture elettriche deve essere eseguita in modo da non interferire con la viabilità veicolare, il transito pedonale dei lavoratori e le operazioni di movimentazione dei carichi.</w:t>
       </w:r>
     </w:p>
     <w:p>
       <w:pPr>
         <w:pStyle w:val="Corpotesto"/>
-        <w:numPr>
-          <w:ilvl w:val="0"/>
-          <w:numId w:val="24"/>
-        </w:numPr>
         <w:rPr>
           <w:rFonts w:ascii="Calibri" w:hAnsi="Calibri"/>
-          <w:lang w:val="it-IT"/>
-        </w:rPr>
-      </w:pPr>
-      <w:r>
+          <w:szCs w:val="24"/>
+          <w:lang w:val="it-IT"/>
+        </w:rPr>
+      </w:pPr>
+    </w:p>
+    <w:p>
+      <w:pPr>
+        <w:pStyle w:val="Corpotesto"/>
         <w:rPr>
           <w:rFonts w:ascii="Calibri" w:hAnsi="Calibri"/>
-          <w:lang w:val="it-IT"/>
-        </w:rPr>
-        <w:t>È vietato effettuare attività di movimentazione nelle immediate vicinanze del corrimano: mantenere distanze di sicurezza.</w:t>
-      </w:r>
-      <w:r>
-        <w:rPr>
-          <w:lang w:val="it-IT"/>
-        </w:rPr>
-        <w:t xml:space="preserve"> </w:t>
+          <w:szCs w:val="24"/>
+          <w:lang w:val="it-IT"/>
+        </w:rPr>
+      </w:pPr>
+      <w:r>
+        <w:rPr>
+          <w:rFonts w:ascii="Calibri" w:hAnsi="Calibri"/>
+          <w:szCs w:val="24"/>
+          <w:lang w:val="it-IT"/>
+        </w:rPr>
+        <w:t>Al personale non espressamente autorizzato e privo di qualifica per lavori elettrici è fatto assoluto divieto di aprire quadri elettrici, smontare apparecchi di illuminazione, venire a contatto con conduttori, manomettere o modificare circuiti elettrici ed entrare all’interno delle cabine di trasformazione. Le attività di misura, controllo ed eventuale intervento in presenza di rischio elettrico sono riservate esclusivamente a personale formalmente abilitato come PES o PAV, in conformità alla norma CEI 11-27.</w:t>
       </w:r>
     </w:p>
     <w:p>
       <w:pPr>
         <w:pStyle w:val="Corpotesto"/>
-        <w:numPr>
-          <w:ilvl w:val="0"/>
-          <w:numId w:val="24"/>
-        </w:numPr>
         <w:rPr>
           <w:rFonts w:ascii="Calibri" w:hAnsi="Calibri"/>
-          <w:lang w:val="it-IT"/>
-        </w:rPr>
-      </w:pPr>
-      <w:r>
-        <w:rPr>
-          <w:rFonts w:ascii="Calibri" w:hAnsi="Calibri"/>
-          <w:lang w:val="it-IT"/>
-        </w:rPr>
-        <w:t>Prima dell'utilizzo l'impresa noleggiatrice (</w:t>
-      </w:r>
-      <w:proofErr w:type="spellStart"/>
-      <w:r>
-        <w:rPr>
-          <w:rFonts w:ascii="Calibri" w:hAnsi="Calibri"/>
-          <w:lang w:val="it-IT"/>
-        </w:rPr>
-        <w:t>Peyrani</w:t>
-      </w:r>
-      <w:proofErr w:type="spellEnd"/>
-      <w:r>
-        <w:rPr>
-          <w:rFonts w:ascii="Calibri" w:hAnsi="Calibri"/>
-          <w:lang w:val="it-IT"/>
-        </w:rPr>
-        <w:t xml:space="preserve">) deve consegnare: </w:t>
-      </w:r>
-    </w:p>
-    <w:p>
-      <w:pPr>
-        <w:pStyle w:val="Corpotesto"/>
-        <w:numPr>
-          <w:ilvl w:val="0"/>
-          <w:numId w:val="29"/>
-        </w:numPr>
-        <w:rPr>
-          <w:rFonts w:ascii="Calibri" w:hAnsi="Calibri"/>
-          <w:lang w:val="it-IT"/>
-        </w:rPr>
-      </w:pPr>
-      <w:r>
-        <w:rPr>
-          <w:rFonts w:ascii="Calibri" w:hAnsi="Calibri"/>
-          <w:lang w:val="it-IT"/>
-        </w:rPr>
-        <w:t xml:space="preserve">dichiarazione di conformità CE, </w:t>
-      </w:r>
-    </w:p>
-    <w:p>
-      <w:pPr>
-        <w:pStyle w:val="Corpotesto"/>
-        <w:numPr>
-          <w:ilvl w:val="0"/>
-          <w:numId w:val="29"/>
-        </w:numPr>
-        <w:rPr>
-          <w:rFonts w:ascii="Calibri" w:hAnsi="Calibri"/>
-          <w:lang w:val="it-IT"/>
-        </w:rPr>
-      </w:pPr>
-      <w:r>
-        <w:rPr>
-          <w:rFonts w:ascii="Calibri" w:hAnsi="Calibri"/>
-          <w:lang w:val="it-IT"/>
-        </w:rPr>
-        <w:t xml:space="preserve">registro di uso/manutenzione, </w:t>
-      </w:r>
-    </w:p>
-    <w:p>
-      <w:pPr>
-        <w:pStyle w:val="Corpotesto"/>
-        <w:numPr>
-          <w:ilvl w:val="0"/>
-          <w:numId w:val="29"/>
-        </w:numPr>
-        <w:rPr>
-          <w:rFonts w:ascii="Calibri" w:hAnsi="Calibri"/>
-          <w:lang w:val="it-IT"/>
-        </w:rPr>
-      </w:pPr>
-      <w:r>
-        <w:rPr>
-          <w:rFonts w:ascii="Calibri" w:hAnsi="Calibri"/>
-          <w:lang w:val="it-IT"/>
-        </w:rPr>
-        <w:t xml:space="preserve">verbale dell'ultima verifica periodica, </w:t>
-      </w:r>
-    </w:p>
-    <w:p>
-      <w:pPr>
-        <w:pStyle w:val="Corpotesto"/>
-        <w:numPr>
-          <w:ilvl w:val="0"/>
-          <w:numId w:val="29"/>
-        </w:numPr>
-        <w:rPr>
-          <w:rFonts w:ascii="Calibri" w:hAnsi="Calibri"/>
-          <w:lang w:val="it-IT"/>
-        </w:rPr>
-      </w:pPr>
-      <w:r>
-        <w:rPr>
-          <w:rFonts w:ascii="Calibri" w:hAnsi="Calibri"/>
-          <w:lang w:val="it-IT"/>
-        </w:rPr>
-        <w:t xml:space="preserve">dichiarazione di regolare manutenzione, </w:t>
-      </w:r>
-    </w:p>
-    <w:p>
-      <w:pPr>
-        <w:pStyle w:val="Corpotesto"/>
-        <w:numPr>
-          <w:ilvl w:val="0"/>
-          <w:numId w:val="29"/>
-        </w:numPr>
-        <w:rPr>
-          <w:rFonts w:ascii="Calibri" w:hAnsi="Calibri"/>
-          <w:lang w:val="it-IT"/>
-        </w:rPr>
-      </w:pPr>
-      <w:r>
-        <w:rPr>
-          <w:rFonts w:ascii="Calibri" w:hAnsi="Calibri"/>
-          <w:lang w:val="it-IT"/>
-        </w:rPr>
-        <w:t>certificazione CE degli accessori di sollevamento e attestato di abilitazione del conduttore.</w:t>
-      </w:r>
-    </w:p>
-    <w:p>
-      <w:pPr>
-        <w:pStyle w:val="Corpotesto"/>
-        <w:rPr>
-          <w:rFonts w:ascii="Calibri" w:hAnsi="Calibri" w:cs="Times New Roman"/>
-          <w:b/>
-          <w:lang w:val="it-IT"/>
-        </w:rPr>
-      </w:pPr>
-      <w:r>
-        <w:rPr>
-          <w:rFonts w:ascii="Calibri" w:hAnsi="Calibri" w:cs="Times New Roman"/>
-          <w:b/>
-          <w:lang w:val="it-IT"/>
-        </w:rPr>
-        <w:t>Misure:</w:t>
-      </w:r>
-    </w:p>
-    <w:p>
-      <w:pPr>
-        <w:pStyle w:val="Corpotesto"/>
-        <w:numPr>
-          <w:ilvl w:val="0"/>
-          <w:numId w:val="32"/>
-        </w:numPr>
-        <w:rPr>
-          <w:rFonts w:ascii="Calibri" w:hAnsi="Calibri" w:cs="Times New Roman"/>
-          <w:lang w:val="it-IT"/>
-        </w:rPr>
-      </w:pPr>
-      <w:r>
-        <w:rPr>
-          <w:rFonts w:ascii="Calibri" w:hAnsi="Calibri" w:cs="Times New Roman"/>
-          <w:lang w:val="it-IT"/>
-        </w:rPr>
-        <w:t>Usare attrezzature a norma di legge, vietando l’uso di attrezzature non rispondenti o danneggiate.</w:t>
-      </w:r>
-    </w:p>
-    <w:p>
-      <w:pPr>
-        <w:pStyle w:val="Corpotesto"/>
-        <w:numPr>
-          <w:ilvl w:val="0"/>
-          <w:numId w:val="32"/>
-        </w:numPr>
-        <w:rPr>
-          <w:rFonts w:ascii="Calibri" w:hAnsi="Calibri" w:cs="Times New Roman"/>
-          <w:lang w:val="it-IT"/>
-        </w:rPr>
-      </w:pPr>
-      <w:r>
-        <w:rPr>
-          <w:rFonts w:ascii="Calibri" w:hAnsi="Calibri" w:cs="Times New Roman"/>
-          <w:lang w:val="it-IT"/>
-        </w:rPr>
-        <w:t>La conduzione e l’utilizzo degli apparecchi di sollevamento può essere effettuato soltanto dal personale dotato della relativa abilitazione.</w:t>
-      </w:r>
-    </w:p>
-    <w:p>
-      <w:pPr>
-        <w:pStyle w:val="Corpotesto"/>
-        <w:numPr>
-          <w:ilvl w:val="0"/>
-          <w:numId w:val="32"/>
-        </w:numPr>
-        <w:rPr>
-          <w:rFonts w:ascii="Calibri" w:hAnsi="Calibri" w:cs="Times New Roman"/>
-          <w:lang w:val="it-IT"/>
-        </w:rPr>
-      </w:pPr>
-      <w:r>
-        <w:rPr>
-          <w:rFonts w:ascii="Calibri" w:hAnsi="Calibri" w:cs="Times New Roman"/>
-          <w:lang w:val="it-IT"/>
-        </w:rPr>
-        <w:t xml:space="preserve">Nel caso di utilizzo di autogru, è vietato posizionare gli stabilizzatori in prossimità del margine della banchina o su piani non resistenti, quali beole, vie di corsa delle gru (binari), coperture dei cunicoli o cavidotti. </w:t>
-      </w:r>
-    </w:p>
-    <w:p>
-      <w:pPr>
-        <w:pStyle w:val="Corpotesto"/>
-        <w:numPr>
-          <w:ilvl w:val="0"/>
-          <w:numId w:val="32"/>
-        </w:numPr>
-        <w:rPr>
-          <w:rFonts w:ascii="Calibri" w:hAnsi="Calibri" w:cs="Times New Roman"/>
-          <w:lang w:val="it-IT"/>
-        </w:rPr>
-      </w:pPr>
-      <w:r>
-        <w:rPr>
-          <w:rFonts w:ascii="Calibri" w:hAnsi="Calibri" w:cs="Times New Roman"/>
-          <w:lang w:val="it-IT"/>
-        </w:rPr>
-        <w:t>Non sono note le portate massime di carico in banchina.</w:t>
-      </w:r>
-    </w:p>
-    <w:p>
-      <w:pPr>
-        <w:pStyle w:val="Corpotesto"/>
-        <w:numPr>
-          <w:ilvl w:val="0"/>
-          <w:numId w:val="32"/>
-        </w:numPr>
-        <w:rPr>
-          <w:rFonts w:ascii="Calibri" w:hAnsi="Calibri" w:cs="Times New Roman"/>
-          <w:lang w:val="it-IT"/>
-        </w:rPr>
-      </w:pPr>
-      <w:r>
-        <w:rPr>
-          <w:rFonts w:ascii="Calibri" w:hAnsi="Calibri" w:cs="Times New Roman"/>
-          <w:lang w:val="it-IT"/>
-        </w:rPr>
-        <w:t>Vietato movimentare i carichi con il personale presente nella sottostante area di intervento.</w:t>
-      </w:r>
-    </w:p>
-    <w:p>
-      <w:pPr>
-        <w:pStyle w:val="Corpotesto"/>
-        <w:numPr>
-          <w:ilvl w:val="0"/>
-          <w:numId w:val="32"/>
-        </w:numPr>
-        <w:rPr>
-          <w:rFonts w:ascii="Calibri" w:hAnsi="Calibri" w:cs="Times New Roman"/>
-          <w:lang w:val="it-IT"/>
-        </w:rPr>
-      </w:pPr>
-      <w:r>
-        <w:rPr>
-          <w:rFonts w:ascii="Calibri" w:hAnsi="Calibri" w:cs="Times New Roman"/>
-          <w:lang w:val="it-IT"/>
-        </w:rPr>
-        <w:t>Non ingombrare con automezzi o materiali le vie di corsa delle gru (binari e cavidotto di alimentazione).</w:t>
-      </w:r>
-    </w:p>
-    <w:p>
-      <w:pPr>
-        <w:pStyle w:val="Corpotesto"/>
-        <w:numPr>
-          <w:ilvl w:val="0"/>
-          <w:numId w:val="32"/>
-        </w:numPr>
-        <w:rPr>
-          <w:rFonts w:ascii="Calibri" w:hAnsi="Calibri" w:cs="Times New Roman"/>
-          <w:lang w:val="it-IT"/>
-        </w:rPr>
-      </w:pPr>
-      <w:r>
-        <w:rPr>
-          <w:rFonts w:ascii="Calibri" w:hAnsi="Calibri" w:cs="Times New Roman"/>
-          <w:lang w:val="it-IT"/>
-        </w:rPr>
-        <w:t>Utilizzare accessori di sollevamento marcati CE.</w:t>
-      </w:r>
-    </w:p>
-    <w:p>
-      <w:pPr>
-        <w:pStyle w:val="Corpotesto"/>
-        <w:numPr>
-          <w:ilvl w:val="0"/>
-          <w:numId w:val="32"/>
-        </w:numPr>
-        <w:rPr>
-          <w:rFonts w:ascii="Calibri" w:hAnsi="Calibri" w:cs="Times New Roman"/>
-          <w:lang w:val="it-IT"/>
-        </w:rPr>
-      </w:pPr>
-      <w:r>
-        <w:rPr>
-          <w:rFonts w:ascii="Calibri" w:hAnsi="Calibri" w:cs="Times New Roman"/>
-          <w:lang w:val="it-IT"/>
-        </w:rPr>
-        <w:t xml:space="preserve">Si raccomanda di rispettare i divieti e le prescrizioni se l’attività da svolgere prevede lo stazionamento nei pressi d’apparecchiature od attrezzature in genere. </w:t>
-      </w:r>
-    </w:p>
-    <w:p>
-      <w:pPr>
-        <w:pStyle w:val="Corpotesto"/>
-        <w:numPr>
-          <w:ilvl w:val="0"/>
-          <w:numId w:val="32"/>
-        </w:numPr>
-        <w:rPr>
-          <w:rFonts w:ascii="Calibri" w:hAnsi="Calibri" w:cs="Times New Roman"/>
-          <w:lang w:val="it-IT"/>
-        </w:rPr>
-      </w:pPr>
-      <w:r>
-        <w:rPr>
-          <w:rFonts w:ascii="Calibri" w:hAnsi="Calibri" w:cs="Times New Roman"/>
-          <w:lang w:val="it-IT"/>
-        </w:rPr>
-        <w:t>Non stazionare od operare nel raggio d’azione dei mezzi di sollevamento ed in particolare nelle aree scoperte destinate alle lavorazioni, banchine lavori, piazzali antistanti alle officine, piazzali nei pressi dei bacini in muratura, ecc. (aree pericolose).</w:t>
-      </w:r>
-    </w:p>
-    <w:p>
-      <w:pPr>
-        <w:pStyle w:val="Corpotesto"/>
-        <w:ind w:left="720"/>
-        <w:rPr>
-          <w:rFonts w:ascii="Calibri" w:hAnsi="Calibri" w:cs="Times New Roman"/>
-          <w:lang w:val="it-IT"/>
-        </w:rPr>
-      </w:pPr>
-    </w:p>
-    <w:p>
-      <w:pPr>
-        <w:pStyle w:val="Corpotesto"/>
-        <w:rPr>
-          <w:rFonts w:ascii="Calibri" w:hAnsi="Calibri" w:cs="Times New Roman"/>
-          <w:b/>
-          <w:lang w:val="it-IT"/>
-        </w:rPr>
-      </w:pPr>
-      <w:r>
-        <w:rPr>
-          <w:rFonts w:ascii="Calibri" w:hAnsi="Calibri" w:cs="Times New Roman"/>
-          <w:b/>
-          <w:lang w:val="it-IT"/>
-        </w:rPr>
-        <w:t>Attuare, inoltre, le seguenti misure:</w:t>
-      </w:r>
-    </w:p>
-    <w:p>
-      <w:pPr>
-        <w:pStyle w:val="Corpotesto"/>
-        <w:numPr>
-          <w:ilvl w:val="0"/>
-          <w:numId w:val="33"/>
-        </w:numPr>
-        <w:rPr>
-          <w:rFonts w:ascii="Calibri" w:hAnsi="Calibri" w:cs="Times New Roman"/>
-          <w:lang w:val="it-IT"/>
-        </w:rPr>
-      </w:pPr>
-      <w:r>
-        <w:rPr>
-          <w:rFonts w:ascii="Calibri" w:hAnsi="Calibri" w:cs="Times New Roman"/>
-          <w:lang w:val="it-IT"/>
-        </w:rPr>
-        <w:t>predisposizione di appositi documenti con l'identificazione degli accessori di sollevamento;</w:t>
-      </w:r>
-    </w:p>
-    <w:p>
-      <w:pPr>
-        <w:pStyle w:val="Corpotesto"/>
-        <w:numPr>
-          <w:ilvl w:val="0"/>
-          <w:numId w:val="33"/>
-        </w:numPr>
-        <w:rPr>
-          <w:rFonts w:ascii="Calibri" w:hAnsi="Calibri" w:cs="Times New Roman"/>
-          <w:lang w:val="it-IT"/>
-        </w:rPr>
-      </w:pPr>
-      <w:r>
-        <w:rPr>
-          <w:rFonts w:ascii="Calibri" w:hAnsi="Calibri" w:cs="Times New Roman"/>
-          <w:lang w:val="it-IT"/>
-        </w:rPr>
-        <w:t xml:space="preserve">verifiche periodiche di legge per tutte le attrezzature di sollevamento e verifiche periodiche trimestrale delle funi degli apparecchi di sollevamento; </w:t>
-      </w:r>
-    </w:p>
-    <w:p>
-      <w:pPr>
-        <w:pStyle w:val="Corpotesto"/>
-        <w:numPr>
-          <w:ilvl w:val="0"/>
-          <w:numId w:val="33"/>
-        </w:numPr>
-        <w:rPr>
-          <w:rFonts w:ascii="Calibri" w:hAnsi="Calibri" w:cs="Times New Roman"/>
-          <w:lang w:val="it-IT"/>
-        </w:rPr>
-      </w:pPr>
-      <w:r>
-        <w:rPr>
-          <w:rFonts w:ascii="Calibri" w:hAnsi="Calibri" w:cs="Times New Roman"/>
-          <w:lang w:val="it-IT"/>
-        </w:rPr>
-        <w:t>manutenzione preventiva programmata dei mezzi di sollevamento, secondo le indicazioni del costruttore;</w:t>
-      </w:r>
-    </w:p>
-    <w:p>
-      <w:pPr>
-        <w:pStyle w:val="Corpotesto"/>
-        <w:numPr>
-          <w:ilvl w:val="0"/>
-          <w:numId w:val="33"/>
-        </w:numPr>
-        <w:rPr>
-          <w:rFonts w:ascii="Calibri" w:hAnsi="Calibri" w:cs="Times New Roman"/>
-          <w:lang w:val="it-IT"/>
-        </w:rPr>
-      </w:pPr>
-      <w:r>
-        <w:rPr>
-          <w:rFonts w:ascii="Calibri" w:hAnsi="Calibri" w:cs="Times New Roman"/>
-          <w:lang w:val="it-IT"/>
-        </w:rPr>
-        <w:t>informazione e formazione del personale;</w:t>
-      </w:r>
-    </w:p>
-    <w:p>
-      <w:pPr>
-        <w:pStyle w:val="Corpotesto"/>
-        <w:numPr>
-          <w:ilvl w:val="0"/>
-          <w:numId w:val="33"/>
-        </w:numPr>
-        <w:rPr>
-          <w:rFonts w:ascii="Calibri" w:hAnsi="Calibri" w:cs="Times New Roman"/>
-          <w:lang w:val="it-IT"/>
-        </w:rPr>
-      </w:pPr>
-      <w:r>
-        <w:rPr>
-          <w:rFonts w:ascii="Calibri" w:hAnsi="Calibri" w:cs="Times New Roman"/>
-          <w:lang w:val="it-IT"/>
-        </w:rPr>
-        <w:t>predisposizione di idonei contenitori per le varie tipologie di materiali sciolti;</w:t>
-      </w:r>
-    </w:p>
-    <w:p>
-      <w:pPr>
-        <w:pStyle w:val="Corpotesto"/>
-        <w:numPr>
-          <w:ilvl w:val="0"/>
-          <w:numId w:val="33"/>
-        </w:numPr>
-        <w:rPr>
-          <w:rFonts w:ascii="Calibri" w:hAnsi="Calibri" w:cs="Times New Roman"/>
-          <w:lang w:val="it-IT"/>
-        </w:rPr>
-      </w:pPr>
-      <w:r>
-        <w:rPr>
-          <w:rFonts w:ascii="Calibri" w:hAnsi="Calibri" w:cs="Times New Roman"/>
-          <w:lang w:val="it-IT"/>
-        </w:rPr>
-        <w:lastRenderedPageBreak/>
-        <w:t>g</w:t>
-      </w:r>
-      <w:r>
-        <w:rPr>
-          <w:rFonts w:ascii="Calibri" w:hAnsi="Calibri" w:cs="Times New Roman"/>
-          <w:lang w:val="it-IT"/>
-        </w:rPr>
-        <w:t>li operatori ed il gruista devono comunicare mediante comunicazione gestuale codificata o</w:t>
-      </w:r>
-      <w:r>
-        <w:rPr>
-          <w:rFonts w:ascii="Calibri" w:hAnsi="Calibri" w:cs="Times New Roman"/>
-          <w:lang w:val="it-IT"/>
-        </w:rPr>
-        <w:t xml:space="preserve"> </w:t>
-      </w:r>
-      <w:r>
-        <w:rPr>
-          <w:rFonts w:ascii="Calibri" w:hAnsi="Calibri" w:cs="Times New Roman"/>
-          <w:lang w:val="it-IT"/>
-        </w:rPr>
-        <w:t>ricetrasmittenti radio;</w:t>
-      </w:r>
-    </w:p>
-    <w:p>
-      <w:pPr>
-        <w:pStyle w:val="Corpotesto"/>
-        <w:numPr>
-          <w:ilvl w:val="0"/>
-          <w:numId w:val="33"/>
-        </w:numPr>
-        <w:rPr>
-          <w:rFonts w:ascii="Calibri" w:hAnsi="Calibri" w:cs="Times New Roman"/>
-          <w:lang w:val="it-IT"/>
-        </w:rPr>
-      </w:pPr>
-      <w:r>
-        <w:rPr>
-          <w:rFonts w:ascii="Calibri" w:hAnsi="Calibri" w:cs="Times New Roman"/>
-          <w:lang w:val="it-IT"/>
-        </w:rPr>
-        <w:t>interdizione di aree sottostanti i lavori in altezza.</w:t>
-      </w:r>
-    </w:p>
-    <w:p>
-      <w:pPr>
-        <w:pStyle w:val="Corpotesto"/>
-        <w:ind w:left="720"/>
-        <w:rPr>
-          <w:rFonts w:ascii="Calibri" w:hAnsi="Calibri" w:cs="Times New Roman"/>
-          <w:lang w:val="it-IT"/>
-        </w:rPr>
-      </w:pPr>
-    </w:p>
-    <w:p>
-      <w:pPr>
-        <w:pStyle w:val="Corpotesto"/>
-        <w:rPr>
-          <w:rFonts w:ascii="Calibri" w:hAnsi="Calibri" w:cs="Times New Roman"/>
-          <w:b/>
-          <w:lang w:val="it-IT"/>
-        </w:rPr>
-      </w:pPr>
-      <w:r>
-        <w:rPr>
-          <w:rFonts w:ascii="Calibri" w:hAnsi="Calibri" w:cs="Times New Roman"/>
-          <w:b/>
-          <w:lang w:val="it-IT"/>
-        </w:rPr>
-        <w:t>Obbligatorio l'uso dei seguenti dispositivi di protezione individuale (DPI):</w:t>
-      </w:r>
-    </w:p>
-    <w:p>
-      <w:pPr>
-        <w:pStyle w:val="Corpotesto"/>
-        <w:numPr>
-          <w:ilvl w:val="0"/>
-          <w:numId w:val="34"/>
-        </w:numPr>
-        <w:rPr>
-          <w:rFonts w:ascii="Calibri" w:hAnsi="Calibri" w:cs="Times New Roman"/>
-          <w:lang w:val="it-IT"/>
-        </w:rPr>
-      </w:pPr>
-      <w:r>
-        <w:rPr>
-          <w:rFonts w:ascii="Calibri" w:hAnsi="Calibri" w:cs="Times New Roman"/>
-          <w:lang w:val="it-IT"/>
-        </w:rPr>
-        <w:t>elmetto di protezione;</w:t>
-      </w:r>
-    </w:p>
-    <w:p>
-      <w:pPr>
-        <w:pStyle w:val="Corpotesto"/>
-        <w:numPr>
-          <w:ilvl w:val="0"/>
-          <w:numId w:val="34"/>
-        </w:numPr>
-        <w:rPr>
-          <w:rFonts w:ascii="Calibri" w:hAnsi="Calibri" w:cs="Times New Roman"/>
-          <w:lang w:val="it-IT"/>
-        </w:rPr>
-      </w:pPr>
-      <w:r>
-        <w:rPr>
-          <w:rFonts w:ascii="Calibri" w:hAnsi="Calibri" w:cs="Times New Roman"/>
-          <w:lang w:val="it-IT"/>
-        </w:rPr>
-        <w:t>guanti per il rischio meccanico;</w:t>
-      </w:r>
-    </w:p>
-    <w:p>
-      <w:pPr>
-        <w:pStyle w:val="Corpotesto"/>
-        <w:numPr>
-          <w:ilvl w:val="0"/>
-          <w:numId w:val="34"/>
-        </w:numPr>
-        <w:rPr>
-          <w:rFonts w:ascii="Calibri" w:hAnsi="Calibri" w:cs="Times New Roman"/>
-          <w:lang w:val="it-IT"/>
-        </w:rPr>
-      </w:pPr>
-      <w:r>
-        <w:rPr>
-          <w:rFonts w:ascii="Calibri" w:hAnsi="Calibri" w:cs="Times New Roman"/>
-          <w:lang w:val="it-IT"/>
-        </w:rPr>
-        <w:t>calzature di sicurezza con puntale in acciaio ed a sfilamento rapido.</w:t>
-      </w:r>
-    </w:p>
-    <w:p>
-      <w:pPr>
-        <w:pStyle w:val="Corpotesto"/>
-        <w:ind w:left="720"/>
-        <w:rPr>
-          <w:rFonts w:ascii="Calibri" w:hAnsi="Calibri" w:cs="Times New Roman"/>
+          <w:szCs w:val="24"/>
           <w:lang w:val="it-IT"/>
         </w:rPr>
       </w:pPr>
@@ -6238,97 +6387,97 @@
           <w:rFonts w:ascii="Calibri" w:hAnsi="Calibri" w:cs="Calibri"/>
           <w:b/>
           <w:i/>
-          <w:sz w:val="26"/>
+          <w:sz w:val="24"/>
           <w:szCs w:val="26"/>
           <w:u w:val="single"/>
         </w:rPr>
-        <w:t xml:space="preserve">13 – Impianti elettrici </w:t>
-      </w:r>
+        <w:t>14 – Primo soccorso</w:t>
+      </w:r>
+    </w:p>
+    <w:p>
+      <w:pPr>
+        <w:jc w:val="both"/>
+        <w:rPr>
+          <w:rFonts w:ascii="Calibri" w:hAnsi="Calibri" w:cs="Calibri"/>
+          <w:szCs w:val="24"/>
+          <w:u w:val="single"/>
+        </w:rPr>
+      </w:pPr>
     </w:p>
     <w:p>
       <w:pPr>
         <w:pStyle w:val="Corpotesto"/>
-        <w:ind w:hanging="1"/>
+        <w:rPr>
+          <w:rFonts w:ascii="Calibri" w:hAnsi="Calibri" w:cs="Calibri"/>
+          <w:szCs w:val="24"/>
+          <w:lang w:val="it-IT" w:eastAsia="it-IT"/>
+        </w:rPr>
+      </w:pPr>
+      <w:r>
+        <w:rPr>
+          <w:rFonts w:ascii="Calibri" w:hAnsi="Calibri" w:cs="Calibri"/>
+          <w:szCs w:val="24"/>
+          <w:lang w:val="it-IT" w:eastAsia="it-IT"/>
+        </w:rPr>
+        <w:t>Il recupero e il trasferimento in sicurezza degli infortunati dalla platea del bacino fino alla banchina sono a cura e onere delle Ditte appaltatrici ed esecutrici, in conformità al contratto e al Piano di Sicurezza e Coordinamento (PSC). Come stabilito dal CSE, l'evacuazione dell'infortunato barellato avviene in via prioritaria tramite il ponteggio a torre scala installato in cantiere; qualora tale modalità risulti impraticabile, l'impresa deve garantire una procedura alternativa (Piano B) con gru dotata di equipaggiamento omologato per il sollevamento di persone in emergenza (barella o navicella certificata).</w:t>
+      </w:r>
+    </w:p>
+    <w:p>
+      <w:pPr>
+        <w:pStyle w:val="Corpotesto"/>
+        <w:rPr>
+          <w:rFonts w:ascii="Calibri" w:hAnsi="Calibri" w:cs="Calibri"/>
+          <w:szCs w:val="24"/>
+          <w:lang w:val="it-IT" w:eastAsia="it-IT"/>
+        </w:rPr>
+      </w:pPr>
+    </w:p>
+    <w:p>
+      <w:pPr>
+        <w:pStyle w:val="Corpotesto"/>
+        <w:rPr>
+          <w:rFonts w:ascii="Calibri" w:hAnsi="Calibri" w:cs="Calibri"/>
+          <w:szCs w:val="24"/>
+          <w:lang w:val="it-IT" w:eastAsia="it-IT"/>
+        </w:rPr>
+      </w:pPr>
+      <w:r>
+        <w:rPr>
+          <w:rFonts w:ascii="Calibri" w:hAnsi="Calibri" w:cs="Calibri"/>
+          <w:szCs w:val="24"/>
+          <w:lang w:val="it-IT" w:eastAsia="it-IT"/>
+        </w:rPr>
+        <w:t>Tutto il personale designato alla gestione delle emergenze dovrà essere specificamente formato, informato e addestrato sulle procedure di soccorso e movimentazione, sia per l'esodo lungo il ponteggio, sia per il recupero in quota tramite mezzo di sollevamento.</w:t>
+      </w:r>
+    </w:p>
+    <w:p>
+      <w:pPr>
+        <w:pStyle w:val="Corpotesto"/>
+        <w:rPr>
+          <w:rFonts w:ascii="Calibri" w:hAnsi="Calibri" w:cs="Calibri"/>
+          <w:szCs w:val="24"/>
+          <w:lang w:val="it-IT" w:eastAsia="it-IT"/>
+        </w:rPr>
+      </w:pPr>
+    </w:p>
+    <w:p>
+      <w:pPr>
+        <w:pStyle w:val="Corpotesto"/>
         <w:rPr>
           <w:rFonts w:ascii="Calibri" w:hAnsi="Calibri"/>
+          <w:lang w:val="it-IT"/>
+        </w:rPr>
+      </w:pPr>
+      <w:r>
+        <w:rPr>
+          <w:rFonts w:ascii="Calibri" w:hAnsi="Calibri" w:cs="Calibri"/>
           <w:szCs w:val="24"/>
-          <w:lang w:val="it-IT"/>
-        </w:rPr>
-      </w:pPr>
-    </w:p>
-    <w:p>
-      <w:pPr>
-        <w:pStyle w:val="Corpotesto"/>
-        <w:rPr>
-          <w:rFonts w:ascii="Calibri" w:hAnsi="Calibri"/>
-          <w:szCs w:val="24"/>
-          <w:lang w:val="it-IT"/>
-        </w:rPr>
-      </w:pPr>
-      <w:r>
-        <w:rPr>
-          <w:rFonts w:ascii="Calibri" w:hAnsi="Calibri"/>
-          <w:szCs w:val="24"/>
-          <w:lang w:val="it-IT"/>
-        </w:rPr>
-        <w:t xml:space="preserve">Il punto di prelievo dell'energia elettrica sarà reso disponibile a cura di </w:t>
+          <w:lang w:val="it-IT" w:eastAsia="it-IT"/>
+        </w:rPr>
+        <w:t>La Sezione Sanitaria di Marinarsen assicura il primo soccorso, negli orari indicati a pag. 6, solo per eventi di lieve entità. A fronte di qualsiasi infortunio il personale preposto della Ditta valuta la criticità dell'evento e, se grave, richiede l'immediato intervento del 118. Resta comunque in capo alle Imprese l'onere dell'estrazione dell'infortunato dal fondo del bacino e del trasferimento in banchina, per affidarlo in sicurezza al personale sanitario subentrante (interno o del 118).</w:t>
       </w:r>
       <w:proofErr w:type="spellStart"/>
-      <w:r>
-        <w:rPr>
-          <w:rFonts w:ascii="Calibri" w:hAnsi="Calibri"/>
-          <w:szCs w:val="24"/>
-          <w:lang w:val="it-IT"/>
-        </w:rPr>
-        <w:t>Marinarsen</w:t>
-      </w:r>
       <w:proofErr w:type="spellEnd"/>
-      <w:r>
-        <w:rPr>
-          <w:rFonts w:ascii="Calibri" w:hAnsi="Calibri"/>
-          <w:szCs w:val="24"/>
-          <w:lang w:val="it-IT"/>
-        </w:rPr>
-        <w:t>; è fatto tassativo divieto di superare l’assorbimento di potenza massima consentita. Il collegamento tra il quadro elettrico di cantiere e il punto di consegna deve essere realizzato a regola d'arte, utilizzando cavi a doppio isolamento con sezione adeguata al carico e guaina idonea per la posa esterna in condizioni ambientali severe. La posa delle condutture elettriche deve essere eseguita in modo da non interferire con la viabilità veicolare, il transito pedonale dei lavoratori e le operazioni di movimentazione dei carichi.</w:t>
-      </w:r>
-    </w:p>
-    <w:p>
-      <w:pPr>
-        <w:pStyle w:val="Corpotesto"/>
-        <w:rPr>
-          <w:rFonts w:ascii="Calibri" w:hAnsi="Calibri"/>
-          <w:szCs w:val="24"/>
-          <w:lang w:val="it-IT"/>
-        </w:rPr>
-      </w:pPr>
-    </w:p>
-    <w:p>
-      <w:pPr>
-        <w:pStyle w:val="Corpotesto"/>
-        <w:rPr>
-          <w:rFonts w:ascii="Calibri" w:hAnsi="Calibri"/>
-          <w:szCs w:val="24"/>
-          <w:lang w:val="it-IT"/>
-        </w:rPr>
-      </w:pPr>
-      <w:r>
-        <w:rPr>
-          <w:rFonts w:ascii="Calibri" w:hAnsi="Calibri"/>
-          <w:szCs w:val="24"/>
-          <w:lang w:val="it-IT"/>
-        </w:rPr>
-        <w:t>Al personale non espressamente autorizzato e privo di qualifica per lavori elettrici è fatto assoluto divieto di aprire quadri elettrici, smontare apparecchi di illuminazione, venire a contatto con conduttori, manomettere o modificare circuiti elettrici ed entrare all’interno delle cabine di trasformazione. Le attività di misura, controllo ed eventuale intervento in presenza di rischio elettrico sono riservate esclusivamente a personale formalmente abilitato come PES o PAV, in conformità alla norma CEI 11-27.</w:t>
-      </w:r>
-    </w:p>
-    <w:p>
-      <w:pPr>
-        <w:pStyle w:val="Corpotesto"/>
-        <w:rPr>
-          <w:rFonts w:ascii="Calibri" w:hAnsi="Calibri"/>
-          <w:szCs w:val="24"/>
-          <w:lang w:val="it-IT"/>
-        </w:rPr>
-      </w:pPr>
     </w:p>
     <w:p>
       <w:pPr>
@@ -6347,113 +6496,181 @@
           <w:rFonts w:ascii="Calibri" w:hAnsi="Calibri" w:cs="Calibri"/>
           <w:b/>
           <w:i/>
-          <w:sz w:val="26"/>
+          <w:sz w:val="24"/>
           <w:szCs w:val="26"/>
           <w:u w:val="single"/>
         </w:rPr>
-        <w:t>14 – Primo soccorso</w:t>
-      </w:r>
-    </w:p>
-    <w:p>
-      <w:pPr>
-        <w:jc w:val="both"/>
-        <w:rPr>
-          <w:rFonts w:ascii="Calibri" w:hAnsi="Calibri" w:cs="Calibri"/>
+        <w:lastRenderedPageBreak/>
+        <w:t>15 – Sorgenti d'incendio e/o esplosione</w:t>
+      </w:r>
+    </w:p>
+    <w:p>
+      <w:pPr>
+        <w:pStyle w:val="Corpotesto"/>
+        <w:rPr>
+          <w:rFonts w:ascii="Calibri" w:hAnsi="Calibri" w:cs="Times New Roman"/>
           <w:szCs w:val="24"/>
-          <w:u w:val="single"/>
+          <w:lang w:val="it-IT"/>
         </w:rPr>
       </w:pPr>
     </w:p>
     <w:p>
       <w:pPr>
         <w:pStyle w:val="Corpotesto"/>
-        <w:rPr>
-          <w:rFonts w:ascii="Calibri" w:hAnsi="Calibri" w:cs="Calibri"/>
+        <w:numPr>
+          <w:ilvl w:val="0"/>
+          <w:numId w:val="37"/>
+        </w:numPr>
+        <w:rPr>
+          <w:rFonts w:ascii="Calibri" w:hAnsi="Calibri" w:cs="Times New Roman"/>
           <w:szCs w:val="24"/>
-          <w:lang w:val="it-IT" w:eastAsia="it-IT"/>
-        </w:rPr>
-      </w:pPr>
-      <w:r>
-        <w:rPr>
-          <w:rFonts w:ascii="Calibri" w:hAnsi="Calibri" w:cs="Calibri"/>
+          <w:lang w:val="it-IT"/>
+        </w:rPr>
+      </w:pPr>
+      <w:r>
+        <w:rPr>
+          <w:rFonts w:ascii="Calibri" w:hAnsi="Calibri" w:cs="Times New Roman"/>
           <w:szCs w:val="24"/>
-          <w:lang w:val="it-IT" w:eastAsia="it-IT"/>
-        </w:rPr>
-        <w:t>Il recupero e il trasferimento in sicurezza di eventuali infortunati dalla platea del bacino fino alla quota viabile della banchina devono essere garantiti a cura e onere delle Ditte appaltatrici ed esecutrici, in conformità alle previsioni contrattuali e al Piano di Sicurezza e Coordinamento (PSC). Come stabilito dal CSE, le operazioni di evacuazione dell'infortunato barellato avverranno in via prioritaria tramite l'utilizzo dell'apposito ponteggio a torre scala installato in cantiere. Tuttavia, qualora tale modalità si rivelasse impraticabile o non idonea alla specifica situazione di emergenza, l'impresa dovrà garantire la tempestiva attuazione di una procedura di recupero alternativa (Piano B), mediante l'utilizzo di una gru dotata di equipaggiamento specificamente omologato per il sollevamento di persone in emergenza (es. barella o navicella certificata).</w:t>
+          <w:lang w:val="it-IT"/>
+        </w:rPr>
+        <w:t xml:space="preserve">Si segnala che il collettore idrico antincendio a servizio del Bacino Ferrati </w:t>
+      </w:r>
+      <w:r>
+        <w:rPr>
+          <w:rFonts w:ascii="Calibri" w:hAnsi="Calibri" w:cs="Times New Roman"/>
+          <w:b/>
+          <w:szCs w:val="24"/>
+          <w:lang w:val="it-IT"/>
+        </w:rPr>
+        <w:t>non è operativo</w:t>
+      </w:r>
+      <w:r>
+        <w:rPr>
+          <w:rFonts w:ascii="Calibri" w:hAnsi="Calibri" w:cs="Times New Roman"/>
+          <w:szCs w:val="24"/>
+          <w:lang w:val="it-IT"/>
+        </w:rPr>
+        <w:t>. Data la temporanea indisponibilità della rete antincendio fissa dell'Ente, l'Impresa esecutrice ha l'obbligo di integrarla e supplirvi dotandosi di un congruo numero di estintori carrellati e portatili supplementari, di tipologia idonea ai carichi d'incendio presenti, da posizionare stabilmente in prossimità dell'area di lavoro prima dell'inizio di qualsiasi attività.</w:t>
       </w:r>
     </w:p>
     <w:p>
       <w:pPr>
         <w:pStyle w:val="Corpotesto"/>
-        <w:rPr>
-          <w:rFonts w:ascii="Calibri" w:hAnsi="Calibri" w:cs="Calibri"/>
+        <w:numPr>
+          <w:ilvl w:val="0"/>
+          <w:numId w:val="37"/>
+        </w:numPr>
+        <w:rPr>
+          <w:rFonts w:ascii="Calibri" w:hAnsi="Calibri" w:cs="Times New Roman"/>
           <w:szCs w:val="24"/>
-          <w:lang w:val="it-IT" w:eastAsia="it-IT"/>
-        </w:rPr>
-      </w:pPr>
+          <w:lang w:val="it-IT"/>
+        </w:rPr>
+      </w:pPr>
+      <w:r>
+        <w:rPr>
+          <w:rFonts w:ascii="Calibri" w:hAnsi="Calibri" w:cs="Times New Roman"/>
+          <w:szCs w:val="24"/>
+          <w:lang w:val="it-IT"/>
+        </w:rPr>
+        <w:t>Prima dell'avvio delle lavorazioni giornaliere i preposti delle ditte devono verificare l'assenza di vapori infiammabili residui nell'area operativa. Sebbene la formazione di gas metano per decomposizione anaerobica nelle casse zavorra delle barcaporte GP65 e GP59 sia un'evenienza molto remota, in caso di dubbio o anomalia olfattiva è obbligatorio sospendere l'accesso e richiedere un controllo ufficiale di gas-free.</w:t>
+      </w:r>
+      <w:proofErr w:type="spellStart"/>
+      <w:proofErr w:type="spellEnd"/>
     </w:p>
     <w:p>
       <w:pPr>
         <w:pStyle w:val="Corpotesto"/>
-        <w:rPr>
-          <w:rFonts w:ascii="Calibri" w:hAnsi="Calibri" w:cs="Calibri"/>
+        <w:numPr>
+          <w:ilvl w:val="0"/>
+          <w:numId w:val="37"/>
+        </w:numPr>
+        <w:rPr>
+          <w:rFonts w:ascii="Calibri" w:hAnsi="Calibri" w:cs="Times New Roman"/>
           <w:szCs w:val="24"/>
-          <w:lang w:val="it-IT" w:eastAsia="it-IT"/>
-        </w:rPr>
-      </w:pPr>
-      <w:r>
-        <w:rPr>
-          <w:rFonts w:ascii="Calibri" w:hAnsi="Calibri" w:cs="Calibri"/>
+          <w:lang w:val="it-IT"/>
+        </w:rPr>
+      </w:pPr>
+      <w:r>
+        <w:rPr>
+          <w:rFonts w:ascii="Calibri" w:hAnsi="Calibri" w:cs="Times New Roman"/>
           <w:szCs w:val="24"/>
-          <w:lang w:val="it-IT" w:eastAsia="it-IT"/>
-        </w:rPr>
-        <w:t>Tutto il personale designato alla gestione delle emergenze dovrà essere specificamente formato, informato e addestrato sulle procedure di soccorso e movimentazione, sia per l'esodo lungo il ponteggio, sia per il recupero in quota tramite mezzo di sollevamento.</w:t>
+          <w:lang w:val="it-IT"/>
+        </w:rPr>
+        <w:t xml:space="preserve">All'interno delle </w:t>
+      </w:r>
+      <w:proofErr w:type="spellStart"/>
+      <w:r>
+        <w:rPr>
+          <w:rFonts w:ascii="Calibri" w:hAnsi="Calibri" w:cs="Times New Roman"/>
+          <w:szCs w:val="24"/>
+          <w:lang w:val="it-IT"/>
+        </w:rPr>
+        <w:t>barcaporte</w:t>
+      </w:r>
+      <w:proofErr w:type="spellEnd"/>
+      <w:r>
+        <w:rPr>
+          <w:rFonts w:ascii="Calibri" w:hAnsi="Calibri" w:cs="Times New Roman"/>
+          <w:szCs w:val="24"/>
+          <w:lang w:val="it-IT"/>
+        </w:rPr>
+        <w:t xml:space="preserve"> GP65 e GP59 non si rileva la presenza di carichi di incendio significativi legati a combustibili liquidi o lubrificanti (oli, carburanti). Tuttavia, l'uso di attrezzature per il taglio termico (ossitaglio e taglio al plasma) introduce un rischio concreto di innesco e combustione dei materiali isolanti (guaine plastiche e polimeriche) dei cavi elettrici e dei quadretti di alimentazione interni alle strutture.</w:t>
       </w:r>
     </w:p>
     <w:p>
       <w:pPr>
         <w:pStyle w:val="Corpotesto"/>
-        <w:rPr>
-          <w:rFonts w:ascii="Calibri" w:hAnsi="Calibri" w:cs="Calibri"/>
+        <w:numPr>
+          <w:ilvl w:val="0"/>
+          <w:numId w:val="37"/>
+        </w:numPr>
+        <w:rPr>
+          <w:rFonts w:ascii="Calibri" w:hAnsi="Calibri" w:cs="Times New Roman"/>
           <w:szCs w:val="24"/>
-          <w:lang w:val="it-IT" w:eastAsia="it-IT"/>
-        </w:rPr>
-      </w:pPr>
+          <w:lang w:val="it-IT"/>
+        </w:rPr>
+      </w:pPr>
+      <w:r>
+        <w:rPr>
+          <w:rFonts w:ascii="Calibri" w:hAnsi="Calibri" w:cs="Times New Roman"/>
+          <w:szCs w:val="24"/>
+          <w:lang w:val="it-IT"/>
+        </w:rPr>
+        <w:t>Durante tutte le operazioni di sezionamento che generano scintille, scorie termiche o proiezione di materiale incandescente, le ditte devono obbligatoriamente predisporre idonei schermi/coperture protettive ignifughe (teli parascintille) e mantenere estintori di pronto impiego a portata di mano dei tagliatori. È fatto assoluto divieto di utilizzare fiamme libere o eseguire lavori a caldo che non siano stati preventivamente autorizzati per iscritto tramite apposito "Permesso di Lavoro a Caldo".</w:t>
+      </w:r>
     </w:p>
     <w:p>
       <w:pPr>
         <w:pStyle w:val="Corpotesto"/>
-        <w:rPr>
-          <w:rFonts w:ascii="Calibri" w:hAnsi="Calibri"/>
-          <w:lang w:val="it-IT"/>
-        </w:rPr>
-      </w:pPr>
-      <w:r>
-        <w:rPr>
-          <w:rFonts w:ascii="Calibri" w:hAnsi="Calibri" w:cs="Calibri"/>
+        <w:numPr>
+          <w:ilvl w:val="0"/>
+          <w:numId w:val="37"/>
+        </w:numPr>
+        <w:rPr>
+          <w:rFonts w:ascii="Calibri" w:hAnsi="Calibri" w:cs="Times New Roman"/>
           <w:szCs w:val="24"/>
-          <w:lang w:val="it-IT" w:eastAsia="it-IT"/>
-        </w:rPr>
-        <w:t xml:space="preserve">Si precisa che la Sezione Sanitaria di </w:t>
-      </w:r>
-      <w:proofErr w:type="spellStart"/>
-      <w:r>
-        <w:rPr>
-          <w:rFonts w:ascii="Calibri" w:hAnsi="Calibri" w:cs="Calibri"/>
+          <w:lang w:val="it-IT"/>
+        </w:rPr>
+      </w:pPr>
+      <w:r>
+        <w:rPr>
+          <w:rFonts w:ascii="Calibri" w:hAnsi="Calibri" w:cs="Times New Roman"/>
           <w:szCs w:val="24"/>
-          <w:lang w:val="it-IT" w:eastAsia="it-IT"/>
-        </w:rPr>
-        <w:t>Marinarsen</w:t>
-      </w:r>
-      <w:proofErr w:type="spellEnd"/>
-      <w:r>
-        <w:rPr>
-          <w:rFonts w:ascii="Calibri" w:hAnsi="Calibri" w:cs="Calibri"/>
+          <w:lang w:val="it-IT"/>
+        </w:rPr>
+        <w:t>L'area destinata allo stoccaggio temporaneo in banchina delle bombole di gas compressi (ossigeno ed acetilene) deve essere chiaramente segnalata tramite cartellonistica di sicurezza ("Pericolo incendio", "Divieto di fumo e fiamme libere"). Lo stoccaggio deve avvenire tassativamente nel rispetto delle norme di sicurezza, utilizzando appositi pallet di contenimento protetti o cestelli porta-bombole provvisti di catene di ritenzione per impedirne la caduta accidentale.</w:t>
+      </w:r>
+    </w:p>
+    <w:p>
+      <w:pPr>
+        <w:pStyle w:val="Corpotesto"/>
+        <w:ind w:left="720"/>
+        <w:rPr>
+          <w:rFonts w:ascii="Calibri" w:hAnsi="Calibri" w:cs="Times New Roman"/>
           <w:szCs w:val="24"/>
-          <w:lang w:val="it-IT" w:eastAsia="it-IT"/>
-        </w:rPr>
-        <w:t xml:space="preserve"> assicura il presidio di primo soccorso, negli orari indicati a pag. 6, esclusivamente per eventi di lieve entità (non gravi). A fronte di qualsiasi infortunio, è dovere del personale preposto della Ditta valutare tempestivamente la criticità dell'evento e, qualora questo rivesta carattere di gravità o emergenza, richiedere l'immediato intervento del Servizio di Emergenza Sanitaria Nazionale (118). Resta in ogni caso tassativamente in capo alle Imprese operanti l'onere materiale e logistico dell'estrazione dell'infortunato dal fondo del bacino e del suo trasferimento in banchina, al fine di poterlo affidare in sicurezza al personale sanitario subentrante (interno o del 118).</w:t>
-      </w:r>
+          <w:lang w:val="it-IT"/>
+        </w:rPr>
+      </w:pPr>
     </w:p>
     <w:p>
       <w:pPr>
@@ -6472,235 +6689,10 @@
           <w:rFonts w:ascii="Calibri" w:hAnsi="Calibri" w:cs="Calibri"/>
           <w:b/>
           <w:i/>
-          <w:sz w:val="26"/>
+          <w:sz w:val="24"/>
           <w:szCs w:val="26"/>
           <w:u w:val="single"/>
         </w:rPr>
-        <w:lastRenderedPageBreak/>
-        <w:t>15 – Sorgenti d'incendio e/o esplosione</w:t>
-      </w:r>
-    </w:p>
-    <w:p>
-      <w:pPr>
-        <w:pStyle w:val="Corpotesto"/>
-        <w:rPr>
-          <w:rFonts w:ascii="Calibri" w:hAnsi="Calibri" w:cs="Times New Roman"/>
-          <w:szCs w:val="24"/>
-          <w:lang w:val="it-IT"/>
-        </w:rPr>
-      </w:pPr>
-    </w:p>
-    <w:p>
-      <w:pPr>
-        <w:pStyle w:val="Corpotesto"/>
-        <w:numPr>
-          <w:ilvl w:val="0"/>
-          <w:numId w:val="37"/>
-        </w:numPr>
-        <w:rPr>
-          <w:rFonts w:ascii="Calibri" w:hAnsi="Calibri" w:cs="Times New Roman"/>
-          <w:szCs w:val="24"/>
-          <w:lang w:val="it-IT"/>
-        </w:rPr>
-      </w:pPr>
-      <w:r>
-        <w:rPr>
-          <w:rFonts w:ascii="Calibri" w:hAnsi="Calibri" w:cs="Times New Roman"/>
-          <w:szCs w:val="24"/>
-          <w:lang w:val="it-IT"/>
-        </w:rPr>
-        <w:t xml:space="preserve">Si segnala che il collettore idrico antincendio a servizio del Bacino Ferrati </w:t>
-      </w:r>
-      <w:r>
-        <w:rPr>
-          <w:rFonts w:ascii="Calibri" w:hAnsi="Calibri" w:cs="Times New Roman"/>
-          <w:b/>
-          <w:szCs w:val="24"/>
-          <w:lang w:val="it-IT"/>
-        </w:rPr>
-        <w:t>non è operativo</w:t>
-      </w:r>
-      <w:r>
-        <w:rPr>
-          <w:rFonts w:ascii="Calibri" w:hAnsi="Calibri" w:cs="Times New Roman"/>
-          <w:szCs w:val="24"/>
-          <w:lang w:val="it-IT"/>
-        </w:rPr>
-        <w:t>. Data la temporanea indisponibilità della rete antincendio fissa dell'Ente, l'Impresa esecutrice ha l'obbligo di integrarla e supplirvi dotandosi di un congruo numero di estintori carrellati e portatili supplementari, di tipologia idonea ai carichi d'incendio presenti, da posizionare stabilmente in prossimità dell'area di lavoro prima dell'inizio di qualsiasi attività.</w:t>
-      </w:r>
-    </w:p>
-    <w:p>
-      <w:pPr>
-        <w:pStyle w:val="Corpotesto"/>
-        <w:numPr>
-          <w:ilvl w:val="0"/>
-          <w:numId w:val="37"/>
-        </w:numPr>
-        <w:rPr>
-          <w:rFonts w:ascii="Calibri" w:hAnsi="Calibri" w:cs="Times New Roman"/>
-          <w:szCs w:val="24"/>
-          <w:lang w:val="it-IT"/>
-        </w:rPr>
-      </w:pPr>
-      <w:r>
-        <w:rPr>
-          <w:rFonts w:ascii="Calibri" w:hAnsi="Calibri" w:cs="Times New Roman"/>
-          <w:szCs w:val="24"/>
-          <w:lang w:val="it-IT"/>
-        </w:rPr>
-        <w:t xml:space="preserve">Prima dell'avvio delle lavorazioni giornaliere, i preposti delle ditte devono verificare l'assenza di vapori infiammabili residui nell'area operativa. Sebbene la formazione di atmosfere pericolose dovuta allo sviluppo di gas metano per decomposizione anaerobica di sostanze organiche sia da ritenersi un'evenienza molto remota — considerati i tempi di formazione e le ridotte quantità di fanghi marini eventualmente presenti nelle casse zavorra delle </w:t>
-      </w:r>
-      <w:proofErr w:type="spellStart"/>
-      <w:r>
-        <w:rPr>
-          <w:rFonts w:ascii="Calibri" w:hAnsi="Calibri" w:cs="Times New Roman"/>
-          <w:szCs w:val="24"/>
-          <w:lang w:val="it-IT"/>
-        </w:rPr>
-        <w:t>barcaporte</w:t>
-      </w:r>
-      <w:proofErr w:type="spellEnd"/>
-      <w:r>
-        <w:rPr>
-          <w:rFonts w:ascii="Calibri" w:hAnsi="Calibri" w:cs="Times New Roman"/>
-          <w:szCs w:val="24"/>
-          <w:lang w:val="it-IT"/>
-        </w:rPr>
-        <w:t xml:space="preserve"> GP65 e GP59 — in caso di qualsiasi dubbio o anomalia olfattiva è fatto obbligo di sospendere l'accesso e richiedere tempestivamente un controllo ufficiale di gas-fre</w:t>
-      </w:r>
-      <w:r>
-        <w:rPr>
-          <w:rFonts w:ascii="Calibri" w:hAnsi="Calibri" w:cs="Times New Roman"/>
-          <w:szCs w:val="24"/>
-          <w:lang w:val="it-IT"/>
-        </w:rPr>
-        <w:t>e</w:t>
-      </w:r>
-      <w:r>
-        <w:rPr>
-          <w:rFonts w:ascii="Calibri" w:hAnsi="Calibri" w:cs="Times New Roman"/>
-          <w:szCs w:val="24"/>
-          <w:lang w:val="it-IT"/>
-        </w:rPr>
-        <w:t>.</w:t>
-      </w:r>
-    </w:p>
-    <w:p>
-      <w:pPr>
-        <w:pStyle w:val="Corpotesto"/>
-        <w:numPr>
-          <w:ilvl w:val="0"/>
-          <w:numId w:val="37"/>
-        </w:numPr>
-        <w:rPr>
-          <w:rFonts w:ascii="Calibri" w:hAnsi="Calibri" w:cs="Times New Roman"/>
-          <w:szCs w:val="24"/>
-          <w:lang w:val="it-IT"/>
-        </w:rPr>
-      </w:pPr>
-      <w:r>
-        <w:rPr>
-          <w:rFonts w:ascii="Calibri" w:hAnsi="Calibri" w:cs="Times New Roman"/>
-          <w:szCs w:val="24"/>
-          <w:lang w:val="it-IT"/>
-        </w:rPr>
-        <w:t xml:space="preserve">All'interno delle </w:t>
-      </w:r>
-      <w:proofErr w:type="spellStart"/>
-      <w:r>
-        <w:rPr>
-          <w:rFonts w:ascii="Calibri" w:hAnsi="Calibri" w:cs="Times New Roman"/>
-          <w:szCs w:val="24"/>
-          <w:lang w:val="it-IT"/>
-        </w:rPr>
-        <w:t>barcaporte</w:t>
-      </w:r>
-      <w:proofErr w:type="spellEnd"/>
-      <w:r>
-        <w:rPr>
-          <w:rFonts w:ascii="Calibri" w:hAnsi="Calibri" w:cs="Times New Roman"/>
-          <w:szCs w:val="24"/>
-          <w:lang w:val="it-IT"/>
-        </w:rPr>
-        <w:t xml:space="preserve"> GP65 e GP59 non si rileva la presenza di carichi di incendio significativi legati a combustibili liquidi o lubrificanti (oli, carburanti). Tuttavia, l'uso di attrezzature per il taglio termico (ossitaglio e taglio al plasma) introduce un rischio concreto di innesco e combustione dei materiali isolanti (guaine plastiche e polimeriche) dei cavi elettrici e dei quadretti di alimentazione interni alle strutture.</w:t>
-      </w:r>
-    </w:p>
-    <w:p>
-      <w:pPr>
-        <w:pStyle w:val="Corpotesto"/>
-        <w:numPr>
-          <w:ilvl w:val="0"/>
-          <w:numId w:val="37"/>
-        </w:numPr>
-        <w:rPr>
-          <w:rFonts w:ascii="Calibri" w:hAnsi="Calibri" w:cs="Times New Roman"/>
-          <w:szCs w:val="24"/>
-          <w:lang w:val="it-IT"/>
-        </w:rPr>
-      </w:pPr>
-      <w:r>
-        <w:rPr>
-          <w:rFonts w:ascii="Calibri" w:hAnsi="Calibri" w:cs="Times New Roman"/>
-          <w:szCs w:val="24"/>
-          <w:lang w:val="it-IT"/>
-        </w:rPr>
-        <w:t>Durante tutte le operazioni di sezionamento che generano scintille, scorie termiche o proiezione di materiale incandescente, le ditte devono obbligatoriamente predisporre idonei schermi/coperture protettive ignifughe (teli parascintille) e mantenere estintori di pronto impiego a portata di mano dei tagliatori. È fatto assoluto divieto di utilizzare fiamme libere o eseguire lavori a caldo che non siano stati preventivamente autorizzati per iscritto tramite apposito "Permesso di Lavoro a Caldo".</w:t>
-      </w:r>
-    </w:p>
-    <w:p>
-      <w:pPr>
-        <w:pStyle w:val="Corpotesto"/>
-        <w:numPr>
-          <w:ilvl w:val="0"/>
-          <w:numId w:val="37"/>
-        </w:numPr>
-        <w:rPr>
-          <w:rFonts w:ascii="Calibri" w:hAnsi="Calibri" w:cs="Times New Roman"/>
-          <w:szCs w:val="24"/>
-          <w:lang w:val="it-IT"/>
-        </w:rPr>
-      </w:pPr>
-      <w:r>
-        <w:rPr>
-          <w:rFonts w:ascii="Calibri" w:hAnsi="Calibri" w:cs="Times New Roman"/>
-          <w:szCs w:val="24"/>
-          <w:lang w:val="it-IT"/>
-        </w:rPr>
-        <w:t>L'area destinata allo stoccaggio temporaneo in banchina delle bombole di gas compressi (ossigeno ed acetilene) deve essere chiaramente segnalata tramite cartellonistica di sicurezza ("Pericolo incendio", "Divieto di fumo e fiamme libere"). Lo stoccaggio deve avvenire tassativamente nel rispetto delle norme di sicurezza, utilizzando appositi pallet di contenimento protetti o cestelli porta-bombole provvisti di catene di ritenzione per impedirne la caduta accidentale.</w:t>
-      </w:r>
-    </w:p>
-    <w:p>
-      <w:pPr>
-        <w:pStyle w:val="Corpotesto"/>
-        <w:ind w:left="720"/>
-        <w:rPr>
-          <w:rFonts w:ascii="Calibri" w:hAnsi="Calibri" w:cs="Times New Roman"/>
-          <w:szCs w:val="24"/>
-          <w:lang w:val="it-IT"/>
-        </w:rPr>
-      </w:pPr>
-    </w:p>
-    <w:p>
-      <w:pPr>
-        <w:jc w:val="both"/>
-        <w:rPr>
-          <w:rFonts w:ascii="Calibri" w:hAnsi="Calibri" w:cs="Calibri"/>
-          <w:b/>
-          <w:i/>
-          <w:sz w:val="26"/>
-          <w:szCs w:val="26"/>
-          <w:u w:val="single"/>
-        </w:rPr>
-      </w:pPr>
-      <w:r>
-        <w:rPr>
-          <w:rFonts w:ascii="Calibri" w:hAnsi="Calibri" w:cs="Calibri"/>
-          <w:b/>
-          <w:i/>
-          <w:sz w:val="26"/>
-          <w:szCs w:val="26"/>
-          <w:u w:val="single"/>
-        </w:rPr>
         <w:t xml:space="preserve">17 – Interconnessione </w:t>
       </w:r>
     </w:p>
@@ -6729,58 +6721,12 @@
           <w:rFonts w:ascii="Calibri" w:hAnsi="Calibri"/>
           <w:szCs w:val="24"/>
         </w:rPr>
-        <w:t xml:space="preserve">Per le strade e le banchine nel Comprensorio non sono note le informazioni circa i carichi massimi sopportabili delle stesse massicciate, né la dettagliata distribuzione degli impianti di servizio presenti sotto il manto stradale. </w:t>
-      </w:r>
-      <w:r>
-        <w:rPr>
-          <w:rFonts w:ascii="Calibri" w:hAnsi="Calibri"/>
-        </w:rPr>
-        <w:t xml:space="preserve">Prestare la massima attenzione durante il transito veicolare </w:t>
-      </w:r>
-      <w:r>
-        <w:rPr>
-          <w:rFonts w:ascii="Calibri" w:hAnsi="Calibri" w:cs="Calibri"/>
-          <w:szCs w:val="24"/>
-          <w:lang w:eastAsia="it-IT"/>
-        </w:rPr>
-        <w:t xml:space="preserve">nei pressi delle aree </w:t>
+        <w:t>Per le strade e le banchine del Comprensorio non sono noti i carichi massimi sopportabili dalle massicciate né la distribuzione dei sottoservizi sotto il manto stradale. Prestare la massima attenzione al transito veicolare in prossimità delle aree cantierizzate, per i rischi di interferenza con i mezzi di lavoro Marinarsen e con gli automezzi privati. Il limite di velocità sulle strade interne è di 20 Km/h.</w:t>
       </w:r>
       <w:proofErr w:type="spellStart"/>
-      <w:r>
-        <w:rPr>
-          <w:rFonts w:ascii="Calibri" w:hAnsi="Calibri" w:cs="Calibri"/>
-          <w:szCs w:val="24"/>
-          <w:lang w:eastAsia="it-IT"/>
-        </w:rPr>
-        <w:t>cantierizzate</w:t>
-      </w:r>
       <w:proofErr w:type="spellEnd"/>
-      <w:r>
-        <w:rPr>
-          <w:rFonts w:ascii="Calibri" w:hAnsi="Calibri" w:cs="Calibri"/>
-          <w:szCs w:val="24"/>
-          <w:lang w:eastAsia="it-IT"/>
-        </w:rPr>
-        <w:t xml:space="preserve"> per eventuali rischi da interferenza dovuti al transito dei mezzi di lavoro </w:t>
-      </w:r>
       <w:proofErr w:type="spellStart"/>
-      <w:r>
-        <w:rPr>
-          <w:rFonts w:ascii="Calibri" w:hAnsi="Calibri" w:cs="Calibri"/>
-          <w:szCs w:val="24"/>
-          <w:lang w:eastAsia="it-IT"/>
-        </w:rPr>
-        <w:t>Marinarsen</w:t>
-      </w:r>
       <w:proofErr w:type="spellEnd"/>
-      <w:r>
-        <w:rPr>
-          <w:rFonts w:ascii="Calibri" w:hAnsi="Calibri" w:cs="Calibri"/>
-          <w:szCs w:val="24"/>
-          <w:lang w:eastAsia="it-IT"/>
-        </w:rPr>
-        <w:t xml:space="preserve"> o per il transito degli automezzi privati. Il limite di velocità sulle strade interne è di 20 Km/h.</w:t>
-      </w:r>
     </w:p>
     <w:p>
       <w:pPr>
@@ -7342,7 +7288,7 @@
           <w:rFonts w:ascii="Calibri" w:hAnsi="Calibri" w:cs="Calibri"/>
           <w:b/>
           <w:i/>
-          <w:sz w:val="26"/>
+          <w:sz w:val="24"/>
           <w:szCs w:val="26"/>
           <w:u w:val="single"/>
         </w:rPr>
@@ -7591,7 +7537,7 @@
           <w:rFonts w:ascii="Calibri" w:hAnsi="Calibri" w:cs="Calibri"/>
           <w:b/>
           <w:i/>
-          <w:sz w:val="26"/>
+          <w:sz w:val="24"/>
           <w:szCs w:val="26"/>
           <w:u w:val="single"/>
         </w:rPr>
@@ -7623,29 +7569,67 @@
       <w:r>
         <w:rPr>
           <w:rFonts w:ascii="Calibri" w:hAnsi="Calibri" w:cs="Calibri"/>
+          <w:sz w:val="24"/>
+          <w:szCs w:val="26"/>
+        </w:rPr>
+        <w:t xml:space="preserve">Tutte le attività all'interno del bacino saranno supervisionate da un referente </w:t>
+      </w:r>
+      <w:proofErr w:type="spellStart"/>
+      <w:r>
+        <w:rPr>
+          <w:rFonts w:ascii="Calibri" w:hAnsi="Calibri" w:cs="Calibri"/>
+          <w:sz w:val="24"/>
+          <w:szCs w:val="26"/>
+        </w:rPr>
+        <w:t>Marinarsen</w:t>
+      </w:r>
+      <w:proofErr w:type="spellEnd"/>
+      <w:r>
+        <w:rPr>
+          <w:rFonts w:ascii="Calibri" w:hAnsi="Calibri" w:cs="Calibri"/>
+          <w:sz w:val="24"/>
+          <w:szCs w:val="26"/>
+        </w:rPr>
+        <w:t>, in stretto coordinamento con il DEC e il CSE. Al fine di garantire la reciproca informazione e cooperazione tra i Datori di Lavoro (Committente, Comando di bordo, Ditte), dovrà essere prevista una riunione preliminare prima dell'inizio dei lavori e successivi incontri periodici convocati dal Capo Ufficio di Programma.</w:t>
+      </w:r>
+    </w:p>
+    <w:p>
+      <w:pPr>
+        <w:jc w:val="both"/>
+        <w:rPr>
+          <w:rFonts w:ascii="Calibri" w:hAnsi="Calibri" w:cs="Calibri"/>
           <w:sz w:val="26"/>
           <w:szCs w:val="26"/>
         </w:rPr>
-        <w:t xml:space="preserve">Tutte le attività all'interno del bacino saranno supervisionate da un referente </w:t>
-      </w:r>
-      <w:proofErr w:type="spellStart"/>
-      <w:r>
+      </w:pPr>
+    </w:p>
+    <w:p>
+      <w:pPr>
+        <w:jc w:val="both"/>
         <w:rPr>
           <w:rFonts w:ascii="Calibri" w:hAnsi="Calibri" w:cs="Calibri"/>
           <w:sz w:val="26"/>
           <w:szCs w:val="26"/>
         </w:rPr>
-        <w:t>Marinarsen</w:t>
-      </w:r>
-      <w:proofErr w:type="spellEnd"/>
-      <w:r>
+      </w:pPr>
+      <w:r>
+        <w:rPr>
+          <w:rFonts w:ascii="Calibri" w:hAnsi="Calibri" w:cs="Calibri"/>
+          <w:sz w:val="24"/>
+          <w:szCs w:val="26"/>
+        </w:rPr>
+        <w:t>Tutto il personale ammesso a svolgere attività lavorativa presso l’Arsenale deve essere formato ed aggiornato alla sicurezza secondo le disposizioni di legge, nonché informato sulle prescrizioni del presente documento. Ogni lavoratore deve essere costantemente identificabile mediante apposito tesserino di riconoscimento con fotografia.</w:t>
+      </w:r>
+    </w:p>
+    <w:p>
+      <w:pPr>
+        <w:jc w:val="both"/>
         <w:rPr>
           <w:rFonts w:ascii="Calibri" w:hAnsi="Calibri" w:cs="Calibri"/>
           <w:sz w:val="26"/>
           <w:szCs w:val="26"/>
         </w:rPr>
-        <w:t>, in stretto coordinamento con il DEC e il CSE. Al fine di garantire la reciproca informazione e cooperazione tra i Datori di Lavoro (Committente, Comando di bordo, Ditte), dovrà essere prevista una riunione preliminare prima dell'inizio dei lavori e successivi incontri periodici convocati dal Capo Ufficio di Programma.</w:t>
-      </w:r>
+      </w:pPr>
     </w:p>
     <w:p>
       <w:pPr>
@@ -7656,6 +7640,14 @@
           <w:szCs w:val="26"/>
         </w:rPr>
       </w:pPr>
+      <w:r>
+        <w:rPr>
+          <w:rFonts w:ascii="Calibri" w:hAnsi="Calibri" w:cs="Calibri"/>
+          <w:sz w:val="24"/>
+          <w:szCs w:val="26"/>
+        </w:rPr>
+        <w:t>È fatto divieto assoluto di consumare bevande alcoliche all'interno dello stabilimento, con particolare e severo rigore per gruisti, manovratori di PLE e addetti ai lavori in quota.</w:t>
+      </w:r>
     </w:p>
     <w:p>
       <w:pPr>
@@ -7666,13 +7658,23 @@
           <w:szCs w:val="26"/>
         </w:rPr>
       </w:pPr>
-      <w:r>
+    </w:p>
+    <w:p>
+      <w:pPr>
+        <w:jc w:val="both"/>
         <w:rPr>
           <w:rFonts w:ascii="Calibri" w:hAnsi="Calibri" w:cs="Calibri"/>
           <w:sz w:val="26"/>
           <w:szCs w:val="26"/>
         </w:rPr>
-        <w:t>Tutto il personale ammesso a svolgere attività lavorativa presso l’Arsenale deve essere formato ed aggiornato alla sicurezza secondo le disposizioni di legge, nonché informato sulle prescrizioni del presente documento. Ogni lavoratore deve essere costantemente identificabile mediante apposito tesserino di riconoscimento con fotografia.</w:t>
+      </w:pPr>
+      <w:r>
+        <w:rPr>
+          <w:rFonts w:ascii="Calibri" w:hAnsi="Calibri" w:cs="Calibri"/>
+          <w:sz w:val="24"/>
+          <w:szCs w:val="26"/>
+        </w:rPr>
+        <w:t>Il preposto della Ditta appaltatrice ha l'obbligo inderogabile di garantire l’osservanza delle disposizioni di legge, di quanto prescritto nel presente documento informativo e dell’effettivo utilizzo dei DPI da parte dei lavoratori, segnalando tempestivamente al proprio Dirigente le eventuali inosservanze.</w:t>
       </w:r>
     </w:p>
     <w:p>
@@ -7697,11 +7699,21 @@
       <w:r>
         <w:rPr>
           <w:rFonts w:ascii="Calibri" w:hAnsi="Calibri" w:cs="Calibri"/>
+          <w:sz w:val="24"/>
+          <w:szCs w:val="26"/>
+        </w:rPr>
+        <w:t>Le aree di lavorazione devono essere costantemente transennate e segnalate in modo da impedire fisicamente l’accesso ai non addetti ai lavori. Come previsto dalla normativa vigente, i numeri di emergenza devono essere chiaramente riportati sulla segnaletica di cantiere.</w:t>
+      </w:r>
+    </w:p>
+    <w:p>
+      <w:pPr>
+        <w:jc w:val="both"/>
+        <w:rPr>
+          <w:rFonts w:ascii="Calibri" w:hAnsi="Calibri" w:cs="Calibri"/>
           <w:sz w:val="26"/>
           <w:szCs w:val="26"/>
         </w:rPr>
-        <w:t>È fatto divieto assoluto di consumare bevande alcoliche all'interno dello stabilimento, con particolare e severo rigore per gruisti, manovratori di PLE e addetti ai lavori in quota.</w:t>
-      </w:r>
+      </w:pPr>
     </w:p>
     <w:p>
       <w:pPr>
@@ -7712,76 +7724,10 @@
           <w:szCs w:val="26"/>
         </w:rPr>
       </w:pPr>
-    </w:p>
-    <w:p>
-      <w:pPr>
-        <w:jc w:val="both"/>
-        <w:rPr>
-          <w:rFonts w:ascii="Calibri" w:hAnsi="Calibri" w:cs="Calibri"/>
-          <w:sz w:val="26"/>
-          <w:szCs w:val="26"/>
-        </w:rPr>
-      </w:pPr>
-      <w:r>
-        <w:rPr>
-          <w:rFonts w:ascii="Calibri" w:hAnsi="Calibri" w:cs="Calibri"/>
-          <w:sz w:val="26"/>
-          <w:szCs w:val="26"/>
-        </w:rPr>
-        <w:t>Il preposto della Ditta appaltatrice ha l'obbligo inderogabile di garantire l’osservanza delle disposizioni di legge, di quanto prescritto nel presente documento informativo e dell’effettivo utilizzo dei DPI da parte dei lavoratori, segnalando tempestivamente al proprio Dirigente le eventuali inosservanze.</w:t>
-      </w:r>
-    </w:p>
-    <w:p>
-      <w:pPr>
-        <w:jc w:val="both"/>
-        <w:rPr>
-          <w:rFonts w:ascii="Calibri" w:hAnsi="Calibri" w:cs="Calibri"/>
-          <w:sz w:val="26"/>
-          <w:szCs w:val="26"/>
-        </w:rPr>
-      </w:pPr>
-    </w:p>
-    <w:p>
-      <w:pPr>
-        <w:jc w:val="both"/>
-        <w:rPr>
-          <w:rFonts w:ascii="Calibri" w:hAnsi="Calibri" w:cs="Calibri"/>
-          <w:sz w:val="26"/>
-          <w:szCs w:val="26"/>
-        </w:rPr>
-      </w:pPr>
-      <w:r>
-        <w:rPr>
-          <w:rFonts w:ascii="Calibri" w:hAnsi="Calibri" w:cs="Calibri"/>
-          <w:sz w:val="26"/>
-          <w:szCs w:val="26"/>
-        </w:rPr>
-        <w:t>Le aree di lavorazione devono essere costantemente transennate e segnalate in modo da impedire fisicamente l’accesso ai non addetti ai lavori. Come previsto dalla normativa vigente, i numeri di emergenza devono essere chiaramente riportati sulla segnaletica di cantiere.</w:t>
-      </w:r>
-    </w:p>
-    <w:p>
-      <w:pPr>
-        <w:jc w:val="both"/>
-        <w:rPr>
-          <w:rFonts w:ascii="Calibri" w:hAnsi="Calibri" w:cs="Calibri"/>
-          <w:sz w:val="26"/>
-          <w:szCs w:val="26"/>
-        </w:rPr>
-      </w:pPr>
-    </w:p>
-    <w:p>
-      <w:pPr>
-        <w:jc w:val="both"/>
-        <w:rPr>
-          <w:rFonts w:ascii="Calibri" w:hAnsi="Calibri" w:cs="Calibri"/>
-          <w:sz w:val="26"/>
-          <w:szCs w:val="26"/>
-        </w:rPr>
-      </w:pPr>
-      <w:r>
-        <w:rPr>
-          <w:rFonts w:ascii="Calibri" w:hAnsi="Calibri" w:cs="Calibri"/>
-          <w:sz w:val="26"/>
+      <w:r>
+        <w:rPr>
+          <w:rFonts w:ascii="Calibri" w:hAnsi="Calibri" w:cs="Calibri"/>
+          <w:sz w:val="24"/>
           <w:szCs w:val="26"/>
         </w:rPr>
         <w:t>Si avverte che non tutte le scale in muratura del bacino risultano standardizzate in termini di alzata e pedata secondo le attuali norme tecniche; si prescrive la massima attenzione durante la discesa e la risalita per l'elevato pericolo di caduta e inciampo.</w:t>
@@ -7811,11 +7757,21 @@
         <w:rPr>
           <w:rFonts w:ascii="Calibri" w:hAnsi="Calibri" w:cs="Calibri"/>
           <w:b/>
+          <w:sz w:val="24"/>
+          <w:szCs w:val="26"/>
+        </w:rPr>
+        <w:t>Tutela Ambientale e Gestione Rifiuti</w:t>
+      </w:r>
+    </w:p>
+    <w:p>
+      <w:pPr>
+        <w:jc w:val="both"/>
+        <w:rPr>
+          <w:rFonts w:ascii="Calibri" w:hAnsi="Calibri" w:cs="Calibri"/>
           <w:sz w:val="26"/>
           <w:szCs w:val="26"/>
         </w:rPr>
-        <w:t>Tutela Ambientale e Gestione Rifiuti</w:t>
-      </w:r>
+      </w:pPr>
     </w:p>
     <w:p>
       <w:pPr>
@@ -7826,6 +7782,14 @@
           <w:szCs w:val="26"/>
         </w:rPr>
       </w:pPr>
+      <w:r>
+        <w:rPr>
+          <w:rFonts w:ascii="Calibri" w:hAnsi="Calibri" w:cs="Calibri"/>
+          <w:sz w:val="24"/>
+          <w:szCs w:val="26"/>
+        </w:rPr>
+        <w:t>Lo stoccaggio dei materiali e dei rifiuti deve essere ordinato e opportunamente segnalato, evitando qualsiasi intralcio alla normale percorribilità sia sulla platea che sulle banchine. È fatto obbligo di mantenere puliti gli spazi operativi provvedendo alla rimozione quotidiana dei residui e alla raccolta dei rifiuti di lavorazione.</w:t>
+      </w:r>
     </w:p>
     <w:p>
       <w:pPr>
@@ -7836,13 +7800,41 @@
           <w:szCs w:val="26"/>
         </w:rPr>
       </w:pPr>
-      <w:r>
+    </w:p>
+    <w:p>
+      <w:pPr>
+        <w:jc w:val="both"/>
         <w:rPr>
           <w:rFonts w:ascii="Calibri" w:hAnsi="Calibri" w:cs="Calibri"/>
           <w:sz w:val="26"/>
           <w:szCs w:val="26"/>
         </w:rPr>
-        <w:t>Lo stoccaggio dei materiali e dei rifiuti deve essere ordinato e opportunamente segnalato, evitando qualsiasi intralcio alla normale percorribilità sia sulla platea che sulle banchine. È fatto obbligo di mantenere puliti gli spazi operativi provvedendo alla rimozione quotidiana dei residui e alla raccolta dei rifiuti di lavorazione.</w:t>
+      </w:pPr>
+      <w:r>
+        <w:rPr>
+          <w:rFonts w:ascii="Calibri" w:hAnsi="Calibri" w:cs="Calibri"/>
+          <w:sz w:val="24"/>
+          <w:szCs w:val="26"/>
+        </w:rPr>
+        <w:t xml:space="preserve">I rifiuti prodotti vanno smaltiti esclusivamente presso centri autorizzati ai sensi del </w:t>
+      </w:r>
+      <w:proofErr w:type="spellStart"/>
+      <w:r>
+        <w:rPr>
+          <w:rFonts w:ascii="Calibri" w:hAnsi="Calibri" w:cs="Calibri"/>
+          <w:sz w:val="24"/>
+          <w:szCs w:val="26"/>
+        </w:rPr>
+        <w:t>D.Lgs.</w:t>
+      </w:r>
+      <w:proofErr w:type="spellEnd"/>
+      <w:r>
+        <w:rPr>
+          <w:rFonts w:ascii="Calibri" w:hAnsi="Calibri" w:cs="Calibri"/>
+          <w:sz w:val="24"/>
+          <w:szCs w:val="26"/>
+        </w:rPr>
+        <w:t xml:space="preserve"> 152/2006. La Ditta è tenuta a consegnare al DEC la 4^ copia del Formulario di Identificazione Rifiuti (FIR), indicando il fascicolo di riferimento e i quantitativi smaltiti.</w:t>
       </w:r>
     </w:p>
     <w:p>
@@ -7867,29 +7859,49 @@
       <w:r>
         <w:rPr>
           <w:rFonts w:ascii="Calibri" w:hAnsi="Calibri" w:cs="Calibri"/>
+          <w:sz w:val="24"/>
+          <w:szCs w:val="26"/>
+        </w:rPr>
+        <w:t>È severamente vietato scaricare o sversare sostanze chimiche direttamente nella platea del bacino. Le ditte devono assicurarsi che le acque di processo derivanti dalle lavorazioni siano raccolte in apposite casse o serbatoi per il successivo smaltimento a norma di legge.</w:t>
+      </w:r>
+    </w:p>
+    <w:p>
+      <w:pPr>
+        <w:jc w:val="both"/>
+        <w:rPr>
+          <w:rFonts w:ascii="Calibri" w:hAnsi="Calibri" w:cs="Calibri"/>
           <w:sz w:val="26"/>
           <w:szCs w:val="26"/>
         </w:rPr>
-        <w:t xml:space="preserve">I rifiuti prodotti vanno smaltiti esclusivamente presso centri autorizzati ai sensi del </w:t>
-      </w:r>
-      <w:proofErr w:type="spellStart"/>
-      <w:r>
+      </w:pPr>
+    </w:p>
+    <w:p>
+      <w:pPr>
+        <w:jc w:val="both"/>
         <w:rPr>
           <w:rFonts w:ascii="Calibri" w:hAnsi="Calibri" w:cs="Calibri"/>
           <w:sz w:val="26"/>
           <w:szCs w:val="26"/>
         </w:rPr>
-        <w:t>D.Lgs.</w:t>
-      </w:r>
-      <w:proofErr w:type="spellEnd"/>
-      <w:r>
+      </w:pPr>
+      <w:r>
+        <w:rPr>
+          <w:rFonts w:ascii="Calibri" w:hAnsi="Calibri" w:cs="Calibri"/>
+          <w:sz w:val="24"/>
+          <w:szCs w:val="26"/>
+        </w:rPr>
+        <w:t>Qualora si verifichino eventi meteorici (pioggia) in presenza di una platea interessata da residui di lavorazione non ancora rimossi, le acque di prima pioggia dovranno essere trattate e gestite alla stregua di acque di processo.</w:t>
+      </w:r>
+    </w:p>
+    <w:p>
+      <w:pPr>
+        <w:jc w:val="both"/>
         <w:rPr>
           <w:rFonts w:ascii="Calibri" w:hAnsi="Calibri" w:cs="Calibri"/>
           <w:sz w:val="26"/>
           <w:szCs w:val="26"/>
         </w:rPr>
-        <w:t xml:space="preserve"> 152/2006. La Ditta è tenuta a consegnare al DEC la 4^ copia del Formulario di Identificazione Rifiuti (FIR), indicando il fascicolo di riferimento e i quantitativi smaltiti.</w:t>
-      </w:r>
+      </w:pPr>
     </w:p>
     <w:p>
       <w:pPr>
@@ -7900,76 +7912,10 @@
           <w:szCs w:val="26"/>
         </w:rPr>
       </w:pPr>
-    </w:p>
-    <w:p>
-      <w:pPr>
-        <w:jc w:val="both"/>
-        <w:rPr>
-          <w:rFonts w:ascii="Calibri" w:hAnsi="Calibri" w:cs="Calibri"/>
-          <w:sz w:val="26"/>
-          <w:szCs w:val="26"/>
-        </w:rPr>
-      </w:pPr>
-      <w:r>
-        <w:rPr>
-          <w:rFonts w:ascii="Calibri" w:hAnsi="Calibri" w:cs="Calibri"/>
-          <w:sz w:val="26"/>
-          <w:szCs w:val="26"/>
-        </w:rPr>
-        <w:t>È severamente vietato scaricare o sversare sostanze chimiche direttamente nella platea del bacino. Le ditte devono assicurarsi che le acque di processo derivanti dalle lavorazioni siano raccolte in apposite casse o serbatoi per il successivo smaltimento a norma di legge.</w:t>
-      </w:r>
-    </w:p>
-    <w:p>
-      <w:pPr>
-        <w:jc w:val="both"/>
-        <w:rPr>
-          <w:rFonts w:ascii="Calibri" w:hAnsi="Calibri" w:cs="Calibri"/>
-          <w:sz w:val="26"/>
-          <w:szCs w:val="26"/>
-        </w:rPr>
-      </w:pPr>
-    </w:p>
-    <w:p>
-      <w:pPr>
-        <w:jc w:val="both"/>
-        <w:rPr>
-          <w:rFonts w:ascii="Calibri" w:hAnsi="Calibri" w:cs="Calibri"/>
-          <w:sz w:val="26"/>
-          <w:szCs w:val="26"/>
-        </w:rPr>
-      </w:pPr>
-      <w:r>
-        <w:rPr>
-          <w:rFonts w:ascii="Calibri" w:hAnsi="Calibri" w:cs="Calibri"/>
-          <w:sz w:val="26"/>
-          <w:szCs w:val="26"/>
-        </w:rPr>
-        <w:t>Qualora si verifichino eventi meteorici (pioggia) in presenza di una platea interessata da residui di lavorazione non ancora rimossi, le acque di prima pioggia dovranno essere trattate e gestite alla stregua di acque di processo.</w:t>
-      </w:r>
-    </w:p>
-    <w:p>
-      <w:pPr>
-        <w:jc w:val="both"/>
-        <w:rPr>
-          <w:rFonts w:ascii="Calibri" w:hAnsi="Calibri" w:cs="Calibri"/>
-          <w:sz w:val="26"/>
-          <w:szCs w:val="26"/>
-        </w:rPr>
-      </w:pPr>
-    </w:p>
-    <w:p>
-      <w:pPr>
-        <w:jc w:val="both"/>
-        <w:rPr>
-          <w:rFonts w:ascii="Calibri" w:hAnsi="Calibri" w:cs="Calibri"/>
-          <w:sz w:val="26"/>
-          <w:szCs w:val="26"/>
-        </w:rPr>
-      </w:pPr>
-      <w:r>
-        <w:rPr>
-          <w:rFonts w:ascii="Calibri" w:hAnsi="Calibri" w:cs="Calibri"/>
-          <w:sz w:val="26"/>
+      <w:r>
+        <w:rPr>
+          <w:rFonts w:ascii="Calibri" w:hAnsi="Calibri" w:cs="Calibri"/>
+          <w:sz w:val="24"/>
           <w:szCs w:val="26"/>
         </w:rPr>
         <w:t>In caso di attività pulverulente, la ditta esecutrice ha l'obbligo di delimitare e schermare la zona operativa con appositi teli, al fine di confinare le lavorazioni ed evitare la diffusione ambientale di polveri e nebbie.</w:t>
@@ -7999,11 +7945,21 @@
         <w:rPr>
           <w:rFonts w:ascii="Calibri" w:hAnsi="Calibri" w:cs="Calibri"/>
           <w:b/>
+          <w:sz w:val="24"/>
+          <w:szCs w:val="26"/>
+        </w:rPr>
+        <w:t>Gestione Emergenze Microclimatiche (Rischio Ipertermia)</w:t>
+      </w:r>
+    </w:p>
+    <w:p>
+      <w:pPr>
+        <w:jc w:val="both"/>
+        <w:rPr>
+          <w:rFonts w:ascii="Calibri" w:hAnsi="Calibri" w:cs="Calibri"/>
           <w:sz w:val="26"/>
           <w:szCs w:val="26"/>
         </w:rPr>
-        <w:t>Gestione Emergenze Microclimatiche (Rischio Ipertermia)</w:t>
-      </w:r>
+      </w:pPr>
     </w:p>
     <w:p>
       <w:pPr>
@@ -8014,47 +7970,13 @@
           <w:szCs w:val="26"/>
         </w:rPr>
       </w:pPr>
-    </w:p>
-    <w:p>
-      <w:pPr>
-        <w:jc w:val="both"/>
-        <w:rPr>
-          <w:rFonts w:ascii="Calibri" w:hAnsi="Calibri" w:cs="Calibri"/>
-          <w:sz w:val="26"/>
+      <w:r>
+        <w:rPr>
+          <w:rFonts w:ascii="Calibri" w:hAnsi="Calibri" w:cs="Calibri"/>
+          <w:sz w:val="24"/>
           <w:szCs w:val="26"/>
         </w:rPr>
-      </w:pPr>
-      <w:r>
-        <w:rPr>
-          <w:rFonts w:ascii="Calibri" w:hAnsi="Calibri" w:cs="Calibri"/>
-          <w:sz w:val="26"/>
-          <w:szCs w:val="26"/>
-        </w:rPr>
-        <w:t>Stress Termico Estivo: L’attività svolta nel periodo estivo all'interno della platea del bacino, specialmente nelle ore più calde della giornata, espone i lavoratori a un grave rischio di ipertermia (colpo di calore) dovuto al microclima sfavorevole e all'irraggiamento. Le Ditte dovranno valutare l'anticipo o il differimento delle lavorazioni fisicamente più impegnative nelle ore meno assolate, prevedere coperture ombreggianti sulle zone di lavoro esterne</w:t>
-      </w:r>
-      <w:r>
-        <w:rPr>
-          <w:rFonts w:ascii="Calibri" w:hAnsi="Calibri" w:cs="Calibri"/>
-          <w:sz w:val="26"/>
-          <w:szCs w:val="26"/>
-        </w:rPr>
-        <w:t xml:space="preserve"> </w:t>
-      </w:r>
-      <w:r>
-        <w:rPr>
-          <w:rFonts w:ascii="Calibri" w:hAnsi="Calibri" w:cs="Calibri"/>
-          <w:sz w:val="26"/>
-          <w:szCs w:val="26"/>
-        </w:rPr>
-        <w:t>e</w:t>
-      </w:r>
-      <w:r>
-        <w:rPr>
-          <w:rFonts w:ascii="Calibri" w:hAnsi="Calibri" w:cs="Calibri"/>
-          <w:sz w:val="26"/>
-          <w:szCs w:val="26"/>
-        </w:rPr>
-        <w:t>, eventualmente, incrementare il numero e la durata delle pause fisiologiche.</w:t>
+        <w:t>Stress Termico Estivo: l'attività estiva nella platea del bacino, specie nelle ore più calde, espone i lavoratori a grave rischio di ipertermia (colpo di calore) per microclima sfavorevole e irraggiamento. Le Ditte dovranno spostare le lavorazioni fisicamente più impegnative nelle ore meno assolate, prevedere coperture ombreggianti sulle zone di lavoro esterne e aumentare numero e durata delle pause fisiologiche.</w:t>
       </w:r>
     </w:p>
     <w:p>

</xml_diff>

<commit_message>
Doc Info Ditte: aggiunte criticita evidenziate (DPR 177/2011 ambienti confinati, indice Allegati, blocco rischio 11, fumi taglio), rinumerazione capitoli e uniformazione terminologica
</commit_message>
<xml_diff>
--- a/Doc_Info ditte (TiTOLO IV) demolizioni GP 65-59.docx
+++ b/Doc_Info ditte (TiTOLO IV) demolizioni GP 65-59.docx
@@ -619,21 +619,7 @@
           <w:rFonts w:ascii="Calibri" w:hAnsi="Calibri" w:cs="Calibri"/>
           <w:lang w:val="it-IT"/>
         </w:rPr>
-        <w:t>rifer</w:t>
-      </w:r>
-      <w:r>
-        <w:rPr>
-          <w:rFonts w:ascii="Calibri" w:hAnsi="Calibri" w:cs="Calibri"/>
-          <w:lang w:val="it-IT"/>
-        </w:rPr>
-        <w:t>I</w:t>
-      </w:r>
-      <w:r>
-        <w:rPr>
-          <w:rFonts w:ascii="Calibri" w:hAnsi="Calibri" w:cs="Calibri"/>
-          <w:lang w:val="it-IT"/>
-        </w:rPr>
-        <w:t>menti del contratto</w:t>
+        <w:t>1) RIFERIMENTI DEL CONTRATTO</w:t>
       </w:r>
     </w:p>
     <w:p>
@@ -743,7 +729,7 @@
           <w:rFonts w:ascii="Calibri" w:hAnsi="Calibri" w:cs="Calibri"/>
           <w:lang w:val="it-IT"/>
         </w:rPr>
-        <w:t>AREE E LOCALI DOVE POSSONO ESSERE SVOLTI I LAVORI</w:t>
+        <w:t>2) AREE E LOCALI DOVE POSSONO ESSERE SVOLTI I LAVORI</w:t>
       </w:r>
     </w:p>
     <w:p>
@@ -828,7 +814,7 @@
           <w:rFonts w:ascii="Calibri" w:hAnsi="Calibri" w:cs="Calibri"/>
           <w:lang w:val="it-IT"/>
         </w:rPr>
-        <w:t>Figure Responsabili ai sensi del D. Lgs. 81/2008</w:t>
+        <w:t>3) Figure Responsabili ai sensi del D. Lgs. 81/2008</w:t>
       </w:r>
     </w:p>
     <w:p>
@@ -1638,7 +1624,7 @@
           <w:u w:val="single"/>
           <w:lang w:eastAsia="it-IT"/>
         </w:rPr>
-        <w:t>DESCRIZIONE DELLE LAVORAZIONI E IMPRESE COINVOLTE</w:t>
+        <w:t>4) DESCRIZIONE DELLE LAVORAZIONI E IMPRESE COINVOLTE</w:t>
       </w:r>
     </w:p>
     <w:p>
@@ -2282,7 +2268,7 @@
                 <w:sz w:val="18"/>
                 <w:lang w:val="it-IT"/>
               </w:rPr>
-              <w:t>Montaggio e mantenimento del ponteggio tipo torre scalo, idoneo anche al recupero dell'infortunato con barella; comodato d'uso alle imprese con limite operativo 150 kg/m2; revisione ogni 15 gg o dopo eventi meteo avversi.</w:t>
+              <w:t>Montaggio e mantenimento del ponteggio tipo torre scala, idoneo anche al recupero dell'infortunato con barella; comodato d'uso alle imprese con limite operativo 150 kg/m2; revisione ogni 15 gg o dopo eventi meteo avversi.</w:t>
             </w:r>
           </w:p>
         </w:tc>
@@ -3120,7 +3106,7 @@
           <w:u w:val="none"/>
           <w:lang w:val="it-IT"/>
         </w:rPr>
-        <w:t>1) INFORMAZIONI GENERALI SULL’ARSENALE DI TARANTO</w:t>
+        <w:t>5) INFORMAZIONI GENERALI SULL’ARSENALE DI TARANTO</w:t>
       </w:r>
     </w:p>
     <w:p>
@@ -3289,7 +3275,7 @@
           <w:u w:val="none"/>
           <w:lang w:val="it-IT"/>
         </w:rPr>
-        <w:t>2) INFORMAZIONI RELATIVE ALLA GESTIONE DELLE EMERGENZE, EVACUAZIONE e PRIMO SOCCORSO.</w:t>
+        <w:t>6) INFORMAZIONI RELATIVE ALLA GESTIONE DELLE EMERGENZE, EVACUAZIONE e PRIMO SOCCORSO.</w:t>
       </w:r>
     </w:p>
     <w:p>
@@ -4585,8 +4571,7 @@
           <w:szCs w:val="32"/>
           <w:u w:val="none"/>
         </w:rPr>
-        <w:lastRenderedPageBreak/>
-        <w:t>3</w:t>
+        <w:t>7</w:t>
       </w:r>
       <w:r>
         <w:rPr>
@@ -4837,7 +4822,7 @@
               <w:rPr>
                 <w:rFonts w:ascii="Calibri" w:hAnsi="Calibri" w:cs="Calibri"/>
               </w:rPr>
-              <w:t>Operazioni di taglio su PLE, accesso ai gradoni e al ponteggio torre scalo.</w:t>
+              <w:t>Operazioni di taglio su PLE, accesso ai gradoni e al ponteggio torre scala.</w:t>
             </w:r>
           </w:p>
         </w:tc>
@@ -5391,7 +5376,7 @@
         <w:rPr>
           <w:rFonts w:ascii="Calibri" w:hAnsi="Calibri"/>
         </w:rPr>
-        <w:t>Rischio legato a residui di idrocarburi, oli, solventi e sostanze tossiche/infiammabili nei sedimenti e nelle acque stagnanti. Prevedere monitoraggio delle atmosfere di lavoro, DPI specifici (maschere filtranti, guanti e tute impermeabili), procedure di decontaminazione e trasmissione al DEC delle schede di sicurezza (SDS) dei prodotti utilizzati.</w:t>
+        <w:t>Rischio legato a residui di idrocarburi, oli, solventi e sostanze tossiche/infiammabili nei sedimenti e nelle acque stagnanti. Prevedere monitoraggio delle atmosfere di lavoro, DPI specifici (maschere filtranti, guanti e tute impermeabili), procedure di decontaminazione e trasmissione al DEC delle schede di sicurezza (SDS) dei prodotti utilizzati. Le operazioni di taglio termico (ossitaglio e taglio al plasma) producono inoltre fumi metallici: prevedere idonea ventilazione/aspirazione e protezione delle vie respiratorie con maschere a filtro idoneo.</w:t>
       </w:r>
     </w:p>
     <w:p>
@@ -6282,93 +6267,23 @@
           <w:szCs w:val="26"/>
           <w:u w:val="single"/>
         </w:rPr>
-        <w:t xml:space="preserve">13 – Impianti elettrici </w:t>
-      </w:r>
-    </w:p>
-    <w:p>
-      <w:pPr>
-        <w:pStyle w:val="Corpotesto"/>
-        <w:ind w:hanging="1"/>
+        <w:t>11 – Movimentazione meccanica e mezzi d'opera</w:t>
+      </w:r>
+    </w:p>
+    <w:p>
+      <w:pPr>
+        <w:widowControl w:val="0"/>
+        <w:jc w:val="both"/>
         <w:rPr>
           <w:rFonts w:ascii="Calibri" w:hAnsi="Calibri"/>
-          <w:szCs w:val="24"/>
-          <w:lang w:val="it-IT"/>
-        </w:rPr>
-      </w:pPr>
-    </w:p>
-    <w:p>
-      <w:pPr>
-        <w:pStyle w:val="Corpotesto"/>
+        </w:rPr>
+      </w:pPr>
+      <w:r>
         <w:rPr>
           <w:rFonts w:ascii="Calibri" w:hAnsi="Calibri"/>
-          <w:szCs w:val="24"/>
-          <w:lang w:val="it-IT"/>
-        </w:rPr>
-      </w:pPr>
-      <w:r>
-        <w:rPr>
-          <w:rFonts w:ascii="Calibri" w:hAnsi="Calibri"/>
-          <w:szCs w:val="24"/>
-          <w:lang w:val="it-IT"/>
-        </w:rPr>
-        <w:t xml:space="preserve">Il punto di prelievo dell'energia elettrica sarà reso disponibile a cura di </w:t>
-      </w:r>
-      <w:proofErr w:type="spellStart"/>
-      <w:r>
-        <w:rPr>
-          <w:rFonts w:ascii="Calibri" w:hAnsi="Calibri"/>
-          <w:szCs w:val="24"/>
-          <w:lang w:val="it-IT"/>
-        </w:rPr>
-        <w:t>Marinarsen</w:t>
-      </w:r>
-      <w:proofErr w:type="spellEnd"/>
-      <w:r>
-        <w:rPr>
-          <w:rFonts w:ascii="Calibri" w:hAnsi="Calibri"/>
-          <w:szCs w:val="24"/>
-          <w:lang w:val="it-IT"/>
-        </w:rPr>
-        <w:t>; è fatto tassativo divieto di superare l’assorbimento di potenza massima consentita. Il collegamento tra il quadro elettrico di cantiere e il punto di consegna deve essere realizzato a regola d'arte, utilizzando cavi a doppio isolamento con sezione adeguata al carico e guaina idonea per la posa esterna in condizioni ambientali severe. La posa delle condutture elettriche deve essere eseguita in modo da non interferire con la viabilità veicolare, il transito pedonale dei lavoratori e le operazioni di movimentazione dei carichi.</w:t>
-      </w:r>
-    </w:p>
-    <w:p>
-      <w:pPr>
-        <w:pStyle w:val="Corpotesto"/>
-        <w:rPr>
-          <w:rFonts w:ascii="Calibri" w:hAnsi="Calibri"/>
-          <w:szCs w:val="24"/>
-          <w:lang w:val="it-IT"/>
-        </w:rPr>
-      </w:pPr>
-    </w:p>
-    <w:p>
-      <w:pPr>
-        <w:pStyle w:val="Corpotesto"/>
-        <w:rPr>
-          <w:rFonts w:ascii="Calibri" w:hAnsi="Calibri"/>
-          <w:szCs w:val="24"/>
-          <w:lang w:val="it-IT"/>
-        </w:rPr>
-      </w:pPr>
-      <w:r>
-        <w:rPr>
-          <w:rFonts w:ascii="Calibri" w:hAnsi="Calibri"/>
-          <w:szCs w:val="24"/>
-          <w:lang w:val="it-IT"/>
-        </w:rPr>
-        <w:t>Al personale non espressamente autorizzato e privo di qualifica per lavori elettrici è fatto assoluto divieto di aprire quadri elettrici, smontare apparecchi di illuminazione, venire a contatto con conduttori, manomettere o modificare circuiti elettrici ed entrare all’interno delle cabine di trasformazione. Le attività di misura, controllo ed eventuale intervento in presenza di rischio elettrico sono riservate esclusivamente a personale formalmente abilitato come PES o PAV, in conformità alla norma CEI 11-27.</w:t>
-      </w:r>
-    </w:p>
-    <w:p>
-      <w:pPr>
-        <w:pStyle w:val="Corpotesto"/>
-        <w:rPr>
-          <w:rFonts w:ascii="Calibri" w:hAnsi="Calibri"/>
-          <w:szCs w:val="24"/>
-          <w:lang w:val="it-IT"/>
-        </w:rPr>
-      </w:pPr>
+        </w:rPr>
+        <w:t>Per la movimentazione di rottami e materiali con camion con ragno e piccoli mezzi movimento terra: segnalare la presenza di mezzi in movimento e interdire l'avvicinamento del personale non addetto; rispettare i limiti di velocita' e operare entro aree di manovra delimitate; garantire la visibilita' dell'operatore e l'uso di indumenti ad alta visibilita' per il personale a terra; e' vietato il transito e lo stazionamento nel raggio d'azione dei mezzi.</w:t>
+      </w:r>
     </w:p>
     <w:p>
       <w:pPr>
@@ -6391,93 +6306,93 @@
           <w:szCs w:val="26"/>
           <w:u w:val="single"/>
         </w:rPr>
-        <w:t>14 – Primo soccorso</w:t>
-      </w:r>
-    </w:p>
-    <w:p>
-      <w:pPr>
-        <w:jc w:val="both"/>
-        <w:rPr>
-          <w:rFonts w:ascii="Calibri" w:hAnsi="Calibri" w:cs="Calibri"/>
-          <w:szCs w:val="24"/>
-          <w:u w:val="single"/>
-        </w:rPr>
-      </w:pPr>
+        <w:t xml:space="preserve">13 – Impianti elettrici </w:t>
+      </w:r>
     </w:p>
     <w:p>
       <w:pPr>
         <w:pStyle w:val="Corpotesto"/>
-        <w:rPr>
-          <w:rFonts w:ascii="Calibri" w:hAnsi="Calibri" w:cs="Calibri"/>
-          <w:szCs w:val="24"/>
-          <w:lang w:val="it-IT" w:eastAsia="it-IT"/>
-        </w:rPr>
-      </w:pPr>
-      <w:r>
-        <w:rPr>
-          <w:rFonts w:ascii="Calibri" w:hAnsi="Calibri" w:cs="Calibri"/>
-          <w:szCs w:val="24"/>
-          <w:lang w:val="it-IT" w:eastAsia="it-IT"/>
-        </w:rPr>
-        <w:t>Il recupero e il trasferimento in sicurezza degli infortunati dalla platea del bacino fino alla banchina sono a cura e onere delle Ditte appaltatrici ed esecutrici, in conformità al contratto e al Piano di Sicurezza e Coordinamento (PSC). Come stabilito dal CSE, l'evacuazione dell'infortunato barellato avviene in via prioritaria tramite il ponteggio a torre scala installato in cantiere; qualora tale modalità risulti impraticabile, l'impresa deve garantire una procedura alternativa (Piano B) con gru dotata di equipaggiamento omologato per il sollevamento di persone in emergenza (barella o navicella certificata).</w:t>
-      </w:r>
+        <w:ind w:hanging="1"/>
+        <w:rPr>
+          <w:rFonts w:ascii="Calibri" w:hAnsi="Calibri"/>
+          <w:szCs w:val="24"/>
+          <w:lang w:val="it-IT"/>
+        </w:rPr>
+      </w:pPr>
     </w:p>
     <w:p>
       <w:pPr>
         <w:pStyle w:val="Corpotesto"/>
         <w:rPr>
-          <w:rFonts w:ascii="Calibri" w:hAnsi="Calibri" w:cs="Calibri"/>
-          <w:szCs w:val="24"/>
-          <w:lang w:val="it-IT" w:eastAsia="it-IT"/>
-        </w:rPr>
-      </w:pPr>
+          <w:rFonts w:ascii="Calibri" w:hAnsi="Calibri"/>
+          <w:szCs w:val="24"/>
+          <w:lang w:val="it-IT"/>
+        </w:rPr>
+      </w:pPr>
+      <w:r>
+        <w:rPr>
+          <w:rFonts w:ascii="Calibri" w:hAnsi="Calibri"/>
+          <w:szCs w:val="24"/>
+          <w:lang w:val="it-IT"/>
+        </w:rPr>
+        <w:t xml:space="preserve">Il punto di prelievo dell'energia elettrica sarà reso disponibile a cura di </w:t>
+      </w:r>
+      <w:proofErr w:type="spellStart"/>
+      <w:r>
+        <w:rPr>
+          <w:rFonts w:ascii="Calibri" w:hAnsi="Calibri"/>
+          <w:szCs w:val="24"/>
+          <w:lang w:val="it-IT"/>
+        </w:rPr>
+        <w:t>Marinarsen</w:t>
+      </w:r>
+      <w:proofErr w:type="spellEnd"/>
+      <w:r>
+        <w:rPr>
+          <w:rFonts w:ascii="Calibri" w:hAnsi="Calibri"/>
+          <w:szCs w:val="24"/>
+          <w:lang w:val="it-IT"/>
+        </w:rPr>
+        <w:t>; è fatto tassativo divieto di superare l’assorbimento di potenza massima consentita. Il collegamento tra il quadro elettrico di cantiere e il punto di consegna deve essere realizzato a regola d'arte, utilizzando cavi a doppio isolamento con sezione adeguata al carico e guaina idonea per la posa esterna in condizioni ambientali severe. La posa delle condutture elettriche deve essere eseguita in modo da non interferire con la viabilità veicolare, il transito pedonale dei lavoratori e le operazioni di movimentazione dei carichi.</w:t>
+      </w:r>
     </w:p>
     <w:p>
       <w:pPr>
         <w:pStyle w:val="Corpotesto"/>
         <w:rPr>
-          <w:rFonts w:ascii="Calibri" w:hAnsi="Calibri" w:cs="Calibri"/>
-          <w:szCs w:val="24"/>
-          <w:lang w:val="it-IT" w:eastAsia="it-IT"/>
-        </w:rPr>
-      </w:pPr>
-      <w:r>
-        <w:rPr>
-          <w:rFonts w:ascii="Calibri" w:hAnsi="Calibri" w:cs="Calibri"/>
-          <w:szCs w:val="24"/>
-          <w:lang w:val="it-IT" w:eastAsia="it-IT"/>
-        </w:rPr>
-        <w:t>Tutto il personale designato alla gestione delle emergenze dovrà essere specificamente formato, informato e addestrato sulle procedure di soccorso e movimentazione, sia per l'esodo lungo il ponteggio, sia per il recupero in quota tramite mezzo di sollevamento.</w:t>
-      </w:r>
+          <w:rFonts w:ascii="Calibri" w:hAnsi="Calibri"/>
+          <w:szCs w:val="24"/>
+          <w:lang w:val="it-IT"/>
+        </w:rPr>
+      </w:pPr>
     </w:p>
     <w:p>
       <w:pPr>
         <w:pStyle w:val="Corpotesto"/>
         <w:rPr>
-          <w:rFonts w:ascii="Calibri" w:hAnsi="Calibri" w:cs="Calibri"/>
-          <w:szCs w:val="24"/>
-          <w:lang w:val="it-IT" w:eastAsia="it-IT"/>
-        </w:rPr>
-      </w:pPr>
+          <w:rFonts w:ascii="Calibri" w:hAnsi="Calibri"/>
+          <w:szCs w:val="24"/>
+          <w:lang w:val="it-IT"/>
+        </w:rPr>
+      </w:pPr>
+      <w:r>
+        <w:rPr>
+          <w:rFonts w:ascii="Calibri" w:hAnsi="Calibri"/>
+          <w:szCs w:val="24"/>
+          <w:lang w:val="it-IT"/>
+        </w:rPr>
+        <w:t>Al personale non espressamente autorizzato e privo di qualifica per lavori elettrici è fatto assoluto divieto di aprire quadri elettrici, smontare apparecchi di illuminazione, venire a contatto con conduttori, manomettere o modificare circuiti elettrici ed entrare all’interno delle cabine di trasformazione. Le attività di misura, controllo ed eventuale intervento in presenza di rischio elettrico sono riservate esclusivamente a personale formalmente abilitato come PES o PAV, in conformità alla norma CEI 11-27.</w:t>
+      </w:r>
     </w:p>
     <w:p>
       <w:pPr>
         <w:pStyle w:val="Corpotesto"/>
         <w:rPr>
           <w:rFonts w:ascii="Calibri" w:hAnsi="Calibri"/>
-          <w:lang w:val="it-IT"/>
-        </w:rPr>
-      </w:pPr>
-      <w:r>
-        <w:rPr>
-          <w:rFonts w:ascii="Calibri" w:hAnsi="Calibri" w:cs="Calibri"/>
-          <w:szCs w:val="24"/>
-          <w:lang w:val="it-IT" w:eastAsia="it-IT"/>
-        </w:rPr>
-        <w:t>La Sezione Sanitaria di Marinarsen assicura il primo soccorso, negli orari indicati a pag. 6, solo per eventi di lieve entità. A fronte di qualsiasi infortunio il personale preposto della Ditta valuta la criticità dell'evento e, se grave, richiede l'immediato intervento del 118. Resta comunque in capo alle Imprese l'onere dell'estrazione dell'infortunato dal fondo del bacino e del trasferimento in banchina, per affidarlo in sicurezza al personale sanitario subentrante (interno o del 118).</w:t>
-      </w:r>
-      <w:proofErr w:type="spellStart"/>
-      <w:proofErr w:type="spellEnd"/>
+          <w:szCs w:val="24"/>
+          <w:lang w:val="it-IT"/>
+        </w:rPr>
+      </w:pPr>
     </w:p>
     <w:p>
       <w:pPr>
@@ -6500,6 +6415,115 @@
           <w:szCs w:val="26"/>
           <w:u w:val="single"/>
         </w:rPr>
+        <w:t>14 – Primo soccorso</w:t>
+      </w:r>
+    </w:p>
+    <w:p>
+      <w:pPr>
+        <w:jc w:val="both"/>
+        <w:rPr>
+          <w:rFonts w:ascii="Calibri" w:hAnsi="Calibri" w:cs="Calibri"/>
+          <w:szCs w:val="24"/>
+          <w:u w:val="single"/>
+        </w:rPr>
+      </w:pPr>
+    </w:p>
+    <w:p>
+      <w:pPr>
+        <w:pStyle w:val="Corpotesto"/>
+        <w:rPr>
+          <w:rFonts w:ascii="Calibri" w:hAnsi="Calibri" w:cs="Calibri"/>
+          <w:szCs w:val="24"/>
+          <w:lang w:val="it-IT" w:eastAsia="it-IT"/>
+        </w:rPr>
+      </w:pPr>
+      <w:r>
+        <w:rPr>
+          <w:rFonts w:ascii="Calibri" w:hAnsi="Calibri" w:cs="Calibri"/>
+          <w:szCs w:val="24"/>
+          <w:lang w:val="it-IT" w:eastAsia="it-IT"/>
+        </w:rPr>
+        <w:t>Il recupero e il trasferimento in sicurezza degli infortunati dalla platea del bacino fino alla banchina sono a cura e onere delle Ditte appaltatrici ed esecutrici, in conformità al contratto e al Piano di Sicurezza e Coordinamento (PSC). Come stabilito dal CSE, l'evacuazione dell'infortunato barellato avviene in via prioritaria tramite il ponteggio a torre scala installato in cantiere; qualora tale modalità risulti impraticabile, l'impresa deve garantire una procedura alternativa (Piano B) con gru dotata di equipaggiamento omologato per il sollevamento di persone in emergenza (barella o navicella certificata).</w:t>
+      </w:r>
+    </w:p>
+    <w:p>
+      <w:pPr>
+        <w:pStyle w:val="Corpotesto"/>
+        <w:rPr>
+          <w:rFonts w:ascii="Calibri" w:hAnsi="Calibri" w:cs="Calibri"/>
+          <w:szCs w:val="24"/>
+          <w:lang w:val="it-IT" w:eastAsia="it-IT"/>
+        </w:rPr>
+      </w:pPr>
+    </w:p>
+    <w:p>
+      <w:pPr>
+        <w:pStyle w:val="Corpotesto"/>
+        <w:rPr>
+          <w:rFonts w:ascii="Calibri" w:hAnsi="Calibri" w:cs="Calibri"/>
+          <w:szCs w:val="24"/>
+          <w:lang w:val="it-IT" w:eastAsia="it-IT"/>
+        </w:rPr>
+      </w:pPr>
+      <w:r>
+        <w:rPr>
+          <w:rFonts w:ascii="Calibri" w:hAnsi="Calibri" w:cs="Calibri"/>
+          <w:szCs w:val="24"/>
+          <w:lang w:val="it-IT" w:eastAsia="it-IT"/>
+        </w:rPr>
+        <w:t>Tutto il personale designato alla gestione delle emergenze dovrà essere specificamente formato, informato e addestrato sulle procedure di soccorso e movimentazione, sia per l'esodo lungo il ponteggio, sia per il recupero in quota tramite mezzo di sollevamento.</w:t>
+      </w:r>
+    </w:p>
+    <w:p>
+      <w:pPr>
+        <w:pStyle w:val="Corpotesto"/>
+        <w:rPr>
+          <w:rFonts w:ascii="Calibri" w:hAnsi="Calibri" w:cs="Calibri"/>
+          <w:szCs w:val="24"/>
+          <w:lang w:val="it-IT" w:eastAsia="it-IT"/>
+        </w:rPr>
+      </w:pPr>
+    </w:p>
+    <w:p>
+      <w:pPr>
+        <w:pStyle w:val="Corpotesto"/>
+        <w:rPr>
+          <w:rFonts w:ascii="Calibri" w:hAnsi="Calibri"/>
+          <w:lang w:val="it-IT"/>
+        </w:rPr>
+      </w:pPr>
+      <w:r>
+        <w:rPr>
+          <w:rFonts w:ascii="Calibri" w:hAnsi="Calibri" w:cs="Calibri"/>
+          <w:szCs w:val="24"/>
+          <w:lang w:val="it-IT" w:eastAsia="it-IT"/>
+        </w:rPr>
+        <w:t>La Sezione Sanitaria di Marinarsen assicura il primo soccorso, negli orari indicati al paragrafo Chiamate di emergenza, solo per eventi di lieve entità. A fronte di qualsiasi infortunio il personale preposto della Ditta valuta la criticità dell'evento e, se grave, richiede l'immediato intervento del 118. Resta comunque in capo alle Imprese l'onere dell'estrazione dell'infortunato dal fondo del bacino e del trasferimento in banchina, per affidarlo in sicurezza al personale sanitario subentrante (interno o del 118).</w:t>
+      </w:r>
+      <w:proofErr w:type="spellStart"/>
+      <w:proofErr w:type="spellEnd"/>
+    </w:p>
+    <w:p>
+      <w:pPr>
+        <w:jc w:val="both"/>
+        <w:rPr>
+          <w:rFonts w:ascii="Calibri" w:hAnsi="Calibri" w:cs="Calibri"/>
+          <w:b/>
+          <w:i/>
+          <w:sz w:val="26"/>
+          <w:szCs w:val="26"/>
+          <w:u w:val="single"/>
+        </w:rPr>
+      </w:pPr>
+      <w:r>
+        <w:rPr>
+          <w:rFonts w:ascii="Calibri" w:hAnsi="Calibri" w:cs="Calibri"/>
+          <w:b/>
+          <w:i/>
+          <w:sz w:val="24"/>
+          <w:szCs w:val="26"/>
+          <w:u w:val="single"/>
+        </w:rPr>
         <w:lastRenderedPageBreak/>
         <w:t>15 – Sorgenti d'incendio e/o esplosione</w:t>
       </w:r>
@@ -6572,7 +6596,7 @@
           <w:szCs w:val="24"/>
           <w:lang w:val="it-IT"/>
         </w:rPr>
-        <w:t>Prima dell'avvio delle lavorazioni giornaliere i preposti delle ditte devono verificare l'assenza di vapori infiammabili residui nell'area operativa. Sebbene la formazione di gas metano per decomposizione anaerobica nelle casse zavorra delle barcaporte GP65 e GP59 sia un'evenienza molto remota, in caso di dubbio o anomalia olfattiva è obbligatorio sospendere l'accesso e richiedere un controllo ufficiale di gas-free.</w:t>
+        <w:t>Prima dell'avvio delle lavorazioni giornaliere i preposti delle ditte devono verificare l'assenza di vapori infiammabili residui nell'area operativa. Sebbene la formazione di gas metano per decomposizione anaerobica nelle casse zavorra delle barche porta GP65 e GP59 sia un'evenienza molto remota, in caso di dubbio o anomalia olfattiva è obbligatorio sospendere l'accesso e richiedere un controllo ufficiale di gas-free.</w:t>
       </w:r>
       <w:proofErr w:type="spellStart"/>
       <w:proofErr w:type="spellEnd"/>
@@ -6596,6 +6620,30 @@
           <w:szCs w:val="24"/>
           <w:lang w:val="it-IT"/>
         </w:rPr>
+        <w:t>Qualora le lavorazioni comportino l'ingresso del personale all'interno delle casse zavorra o di altri vani chiusi delle barche porta, tali spazi sono da considerarsi ambienti sospetti di inquinamento o confinati: l'accesso e' consentito esclusivamente nel rispetto del D.P.R. 177/2011 e dell'art. 66 e Allegato IV del D.Lgs. 81/2008, previa qualificazione delle imprese, bonifica e misura dell'atmosfera (ossigeno, gas tossici/infiammabili), procedura di lavoro autorizzata, presidio dall'esterno e predisposizione dei sistemi di recupero dell'operatore.</w:t>
+      </w:r>
+      <w:proofErr w:type="spellStart"/>
+      <w:proofErr w:type="spellEnd"/>
+    </w:p>
+    <w:p>
+      <w:pPr>
+        <w:pStyle w:val="Corpotesto"/>
+        <w:numPr>
+          <w:ilvl w:val="0"/>
+          <w:numId w:val="37"/>
+        </w:numPr>
+        <w:rPr>
+          <w:rFonts w:ascii="Calibri" w:hAnsi="Calibri" w:cs="Times New Roman"/>
+          <w:szCs w:val="24"/>
+          <w:lang w:val="it-IT"/>
+        </w:rPr>
+      </w:pPr>
+      <w:r>
+        <w:rPr>
+          <w:rFonts w:ascii="Calibri" w:hAnsi="Calibri" w:cs="Times New Roman"/>
+          <w:szCs w:val="24"/>
+          <w:lang w:val="it-IT"/>
+        </w:rPr>
         <w:t xml:space="preserve">All'interno delle </w:t>
       </w:r>
       <w:proofErr w:type="spellStart"/>
@@ -6605,7 +6653,7 @@
           <w:szCs w:val="24"/>
           <w:lang w:val="it-IT"/>
         </w:rPr>
-        <w:t>barcaporte</w:t>
+        <w:t>barche porta</w:t>
       </w:r>
       <w:proofErr w:type="spellEnd"/>
       <w:r>
@@ -7456,7 +7504,7 @@
         <w:rPr>
           <w:rFonts w:ascii="Calibri" w:hAnsi="Calibri"/>
         </w:rPr>
-        <w:t>barcaporta</w:t>
+        <w:t>barca porta</w:t>
       </w:r>
       <w:proofErr w:type="spellEnd"/>
       <w:r>
@@ -8507,7 +8555,7 @@
                 <w:rFonts w:ascii="Calibri" w:hAnsi="Calibri" w:cs="Calibri"/>
                 <w:lang w:val="it-IT"/>
               </w:rPr>
-              <w:t>Utilizzo del ponteggio (torre scalo)</w:t>
+              <w:t>Utilizzo del ponteggio (torre scala)</w:t>
             </w:r>
           </w:p>
         </w:tc>
@@ -9403,7 +9451,7 @@
         <w:pStyle w:val="Titolo1"/>
       </w:pPr>
       <w:r>
-        <w:t>DISPOSIZIONI FINALI E PRESCRIZIONI GENERALI</w:t>
+        <w:t>8) DISPOSIZIONI FINALI E PRESCRIZIONI GENERALI</w:t>
       </w:r>
     </w:p>
     <w:p>
@@ -9613,6 +9661,62 @@
           <w:lang w:eastAsia="ar-SA"/>
         </w:rPr>
       </w:pPr>
+    </w:p>
+    <w:p>
+      <w:pPr>
+        <w:pStyle w:val="Titolo1"/>
+      </w:pPr>
+      <w:r>
+        <w:t>9) ALLEGATI</w:t>
+      </w:r>
+    </w:p>
+    <w:p>
+      <w:pPr>
+        <w:pStyle w:val="Puntoelenco"/>
+      </w:pPr>
+      <w:r>
+        <w:t>Layout / planimetria di cantiere (con centro di raccolta esterno e ubicazione della Sala Medica).</w:t>
+      </w:r>
+    </w:p>
+    <w:p>
+      <w:pPr>
+        <w:pStyle w:val="Puntoelenco"/>
+      </w:pPr>
+      <w:r>
+        <w:t>Piano di Sicurezza e Coordinamento - PSC_Ferrati Rev. 5.</w:t>
+      </w:r>
+    </w:p>
+    <w:p>
+      <w:pPr>
+        <w:pStyle w:val="Puntoelenco"/>
+      </w:pPr>
+      <w:r>
+        <w:t>Cronoprogramma dei lavori aggiornato a cura del CSE.</w:t>
+      </w:r>
+    </w:p>
+    <w:p>
+      <w:pPr>
+        <w:pStyle w:val="Puntoelenco"/>
+      </w:pPr>
+      <w:r>
+        <w:t>Ordine del giorno n. 199 del 13/02/2026 - accessi al comprensorio.</w:t>
+      </w:r>
+    </w:p>
+    <w:p>
+      <w:pPr>
+        <w:pStyle w:val="Puntoelenco"/>
+      </w:pPr>
+      <w:r>
+        <w:t>Comunicazione di Servizio VDA/070 del 09/04/2026 - reperibilita' servizi di guardia e vigilanza.</w:t>
+      </w:r>
+    </w:p>
+    <w:p>
+      <w:pPr>
+        <w:pStyle w:val="Puntoelenco"/>
+      </w:pPr>
+      <w:r>
+        <w:t>Lettera d'ordine e allegato economico relativi al Fasc. 2511/25 Ordine nr. 1.</w:t>
+      </w:r>
     </w:p>
     <w:sectPr>
       <w:headerReference w:type="default" r:id="rId14"/>

</xml_diff>